<commit_message>
update gambar sarana dan prasarana
</commit_message>
<xml_diff>
--- a/DOKUMEN PELENGKAP/SARANA DAN PRASARANA.docx
+++ b/DOKUMEN PELENGKAP/SARANA DAN PRASARANA.docx
@@ -568,9 +568,11 @@
               </w:rPr>
               <w:t xml:space="preserve"> </w:t>
             </w:r>
+            <w:proofErr w:type="spellStart"/>
             <w:r>
               <w:t>bersih</w:t>
             </w:r>
+            <w:proofErr w:type="spellEnd"/>
             <w:r>
               <w:rPr>
                 <w:spacing w:val="-13"/>
@@ -586,8 +588,62 @@
               </w:rPr>
               <w:t xml:space="preserve"> </w:t>
             </w:r>
+            <w:proofErr w:type="spellStart"/>
             <w:r>
               <w:t>sanitasi</w:t>
+            </w:r>
+            <w:proofErr w:type="spellEnd"/>
+          </w:p>
+          <w:p>
+            <w:pPr>
+              <w:pStyle w:val="TableParagraph"/>
+              <w:ind w:left="114"/>
+            </w:pPr>
+            <w:r>
+              <w:rPr>
+                <w:noProof/>
+              </w:rPr>
+              <w:drawing>
+                <wp:inline distT="0" distB="0" distL="0" distR="0" wp14:anchorId="6288EA6A" wp14:editId="6B89AF82">
+                  <wp:extent cx="2738120" cy="3650615"/>
+                  <wp:effectExtent l="0" t="0" r="5080" b="6985"/>
+                  <wp:docPr id="1855289674" name="Gambar 1" descr="Sebuah gambar berisi dalam ruangan, dinding, Perlengkapan pipa, kamar mandi&#10;&#10;Konten yang dihasilkan AI mungkin salah."/>
+                  <wp:cNvGraphicFramePr>
+                    <a:graphicFrameLocks xmlns:a="http://schemas.openxmlformats.org/drawingml/2006/main" noChangeAspect="1"/>
+                  </wp:cNvGraphicFramePr>
+                  <a:graphic xmlns:a="http://schemas.openxmlformats.org/drawingml/2006/main">
+                    <a:graphicData uri="http://schemas.openxmlformats.org/drawingml/2006/picture">
+                      <pic:pic xmlns:pic="http://schemas.openxmlformats.org/drawingml/2006/picture">
+                        <pic:nvPicPr>
+                          <pic:cNvPr id="1855289674" name="Gambar 1" descr="Sebuah gambar berisi dalam ruangan, dinding, Perlengkapan pipa, kamar mandi&#10;&#10;Konten yang dihasilkan AI mungkin salah."/>
+                          <pic:cNvPicPr/>
+                        </pic:nvPicPr>
+                        <pic:blipFill>
+                          <a:blip r:embed="rId5" cstate="print">
+                            <a:extLst>
+                              <a:ext uri="{28A0092B-C50C-407E-A947-70E740481C1C}">
+                                <a14:useLocalDpi xmlns:a14="http://schemas.microsoft.com/office/drawing/2010/main" val="0"/>
+                              </a:ext>
+                            </a:extLst>
+                          </a:blip>
+                          <a:stretch>
+                            <a:fillRect/>
+                          </a:stretch>
+                        </pic:blipFill>
+                        <pic:spPr>
+                          <a:xfrm>
+                            <a:off x="0" y="0"/>
+                            <a:ext cx="2738120" cy="3650615"/>
+                          </a:xfrm>
+                          <a:prstGeom prst="rect">
+                            <a:avLst/>
+                          </a:prstGeom>
+                        </pic:spPr>
+                      </pic:pic>
+                    </a:graphicData>
+                  </a:graphic>
+                </wp:inline>
+              </w:drawing>
             </w:r>
           </w:p>
         </w:tc>
@@ -862,39 +918,14 @@
           <w:p>
             <w:pPr>
               <w:pStyle w:val="TableParagraph"/>
-              <w:rPr>
-                <w:b/>
-                <w:sz w:val="24"/>
-              </w:rPr>
-            </w:pPr>
-          </w:p>
-          <w:p>
-            <w:pPr>
-              <w:pStyle w:val="TableParagraph"/>
-              <w:rPr>
-                <w:b/>
-                <w:sz w:val="24"/>
-              </w:rPr>
-            </w:pPr>
-          </w:p>
-          <w:p>
-            <w:pPr>
-              <w:pStyle w:val="TableParagraph"/>
-              <w:rPr>
-                <w:b/>
-                <w:sz w:val="24"/>
-              </w:rPr>
-            </w:pPr>
-          </w:p>
-          <w:p>
-            <w:pPr>
-              <w:pStyle w:val="TableParagraph"/>
               <w:spacing w:before="186"/>
               <w:ind w:left="114"/>
             </w:pPr>
+            <w:proofErr w:type="spellStart"/>
             <w:r>
               <w:t>Instalasi</w:t>
             </w:r>
+            <w:proofErr w:type="spellEnd"/>
             <w:r>
               <w:rPr>
                 <w:spacing w:val="-13"/>
@@ -902,7 +933,60 @@
               <w:t xml:space="preserve"> </w:t>
             </w:r>
             <w:r>
-              <w:t>listrik</w:t>
+              <w:t>Listrik</w:t>
+            </w:r>
+          </w:p>
+          <w:p>
+            <w:pPr>
+              <w:pStyle w:val="TableParagraph"/>
+              <w:spacing w:before="186"/>
+              <w:ind w:left="114"/>
+            </w:pPr>
+            <w:r>
+              <w:rPr>
+                <w:noProof/>
+              </w:rPr>
+              <w:drawing>
+                <wp:inline distT="0" distB="0" distL="0" distR="0" wp14:anchorId="55315932" wp14:editId="76DBDBBC">
+                  <wp:extent cx="2738120" cy="3650615"/>
+                  <wp:effectExtent l="0" t="0" r="5080" b="6985"/>
+                  <wp:docPr id="1037591785" name="Gambar 2"/>
+                  <wp:cNvGraphicFramePr>
+                    <a:graphicFrameLocks xmlns:a="http://schemas.openxmlformats.org/drawingml/2006/main" noChangeAspect="1"/>
+                  </wp:cNvGraphicFramePr>
+                  <a:graphic xmlns:a="http://schemas.openxmlformats.org/drawingml/2006/main">
+                    <a:graphicData uri="http://schemas.openxmlformats.org/drawingml/2006/picture">
+                      <pic:pic xmlns:pic="http://schemas.openxmlformats.org/drawingml/2006/picture">
+                        <pic:nvPicPr>
+                          <pic:cNvPr id="1037591785" name="Gambar 1037591785"/>
+                          <pic:cNvPicPr/>
+                        </pic:nvPicPr>
+                        <pic:blipFill>
+                          <a:blip r:embed="rId6" cstate="print">
+                            <a:extLst>
+                              <a:ext uri="{28A0092B-C50C-407E-A947-70E740481C1C}">
+                                <a14:useLocalDpi xmlns:a14="http://schemas.microsoft.com/office/drawing/2010/main" val="0"/>
+                              </a:ext>
+                            </a:extLst>
+                          </a:blip>
+                          <a:stretch>
+                            <a:fillRect/>
+                          </a:stretch>
+                        </pic:blipFill>
+                        <pic:spPr>
+                          <a:xfrm>
+                            <a:off x="0" y="0"/>
+                            <a:ext cx="2738120" cy="3650615"/>
+                          </a:xfrm>
+                          <a:prstGeom prst="rect">
+                            <a:avLst/>
+                          </a:prstGeom>
+                        </pic:spPr>
+                      </pic:pic>
+                    </a:graphicData>
+                  </a:graphic>
+                </wp:inline>
+              </w:drawing>
             </w:r>
           </w:p>
         </w:tc>
@@ -1168,47 +1252,90 @@
           <w:p>
             <w:pPr>
               <w:pStyle w:val="TableParagraph"/>
-              <w:rPr>
-                <w:b/>
-                <w:sz w:val="24"/>
-              </w:rPr>
-            </w:pPr>
-          </w:p>
-          <w:p>
-            <w:pPr>
-              <w:pStyle w:val="TableParagraph"/>
-              <w:rPr>
-                <w:b/>
-                <w:sz w:val="24"/>
-              </w:rPr>
-            </w:pPr>
-          </w:p>
-          <w:p>
-            <w:pPr>
-              <w:pStyle w:val="TableParagraph"/>
               <w:spacing w:before="197"/>
               <w:ind w:left="114"/>
             </w:pPr>
+            <w:proofErr w:type="spellStart"/>
             <w:r>
               <w:t>Instalasi</w:t>
             </w:r>
+            <w:proofErr w:type="spellEnd"/>
             <w:r>
               <w:rPr>
                 <w:spacing w:val="-8"/>
               </w:rPr>
               <w:t xml:space="preserve"> </w:t>
             </w:r>
+            <w:proofErr w:type="spellStart"/>
             <w:r>
               <w:t>sirkulasi</w:t>
             </w:r>
+            <w:proofErr w:type="spellEnd"/>
             <w:r>
               <w:rPr>
                 <w:spacing w:val="-2"/>
               </w:rPr>
               <w:t xml:space="preserve"> </w:t>
             </w:r>
+            <w:proofErr w:type="spellStart"/>
             <w:r>
               <w:t>udara</w:t>
+            </w:r>
+            <w:proofErr w:type="spellEnd"/>
+            <w:r>
+              <w:rPr>
+                <w:noProof/>
+              </w:rPr>
+              <w:drawing>
+                <wp:inline distT="0" distB="0" distL="0" distR="0" wp14:anchorId="7EFA6F20" wp14:editId="4D8B5F82">
+                  <wp:extent cx="2738120" cy="1497965"/>
+                  <wp:effectExtent l="0" t="0" r="5080" b="6985"/>
+                  <wp:docPr id="741716667" name="Gambar 5" descr="Sebuah gambar berisi dinding, dalam ruangan, Peralatan Rumah tangga, Kipas mekanis&#10;&#10;Konten yang dihasilkan AI mungkin salah."/>
+                  <wp:cNvGraphicFramePr>
+                    <a:graphicFrameLocks xmlns:a="http://schemas.openxmlformats.org/drawingml/2006/main" noChangeAspect="1"/>
+                  </wp:cNvGraphicFramePr>
+                  <a:graphic xmlns:a="http://schemas.openxmlformats.org/drawingml/2006/main">
+                    <a:graphicData uri="http://schemas.openxmlformats.org/drawingml/2006/picture">
+                      <pic:pic xmlns:pic="http://schemas.openxmlformats.org/drawingml/2006/picture">
+                        <pic:nvPicPr>
+                          <pic:cNvPr id="741716667" name="Gambar 5" descr="Sebuah gambar berisi dinding, dalam ruangan, Peralatan Rumah tangga, Kipas mekanis&#10;&#10;Konten yang dihasilkan AI mungkin salah."/>
+                          <pic:cNvPicPr/>
+                        </pic:nvPicPr>
+                        <pic:blipFill rotWithShape="1">
+                          <a:blip r:embed="rId7" cstate="print">
+                            <a:extLst>
+                              <a:ext uri="{28A0092B-C50C-407E-A947-70E740481C1C}">
+                                <a14:useLocalDpi xmlns:a14="http://schemas.microsoft.com/office/drawing/2010/main" val="0"/>
+                              </a:ext>
+                            </a:extLst>
+                          </a:blip>
+                          <a:srcRect t="58967"/>
+                          <a:stretch>
+                            <a:fillRect/>
+                          </a:stretch>
+                        </pic:blipFill>
+                        <pic:spPr bwMode="auto">
+                          <a:xfrm>
+                            <a:off x="0" y="0"/>
+                            <a:ext cx="2738120" cy="1497965"/>
+                          </a:xfrm>
+                          <a:prstGeom prst="rect">
+                            <a:avLst/>
+                          </a:prstGeom>
+                          <a:ln>
+                            <a:noFill/>
+                          </a:ln>
+                          <a:extLst>
+                            <a:ext uri="{53640926-AAD7-44D8-BBD7-CCE9431645EC}">
+                              <a14:shadowObscured xmlns:a14="http://schemas.microsoft.com/office/drawing/2010/main"/>
+                            </a:ext>
+                          </a:extLst>
+                        </pic:spPr>
+                      </pic:pic>
+                    </a:graphicData>
+                  </a:graphic>
+                </wp:inline>
+              </w:drawing>
             </w:r>
           </w:p>
         </w:tc>
@@ -1508,6 +1635,7 @@
               <w:jc w:val="center"/>
             </w:pPr>
             <w:r>
+              <w:lastRenderedPageBreak/>
               <w:t>4</w:t>
             </w:r>
           </w:p>
@@ -1522,8 +1650,65 @@
               <w:spacing w:before="145"/>
               <w:ind w:left="114"/>
             </w:pPr>
+            <w:proofErr w:type="spellStart"/>
             <w:r>
               <w:t>Penerangan</w:t>
+            </w:r>
+            <w:proofErr w:type="spellEnd"/>
+            <w:r>
+              <w:rPr>
+                <w:noProof/>
+              </w:rPr>
+              <w:drawing>
+                <wp:inline distT="0" distB="0" distL="0" distR="0" wp14:anchorId="4B96820B" wp14:editId="2CA83F26">
+                  <wp:extent cx="2738120" cy="2425700"/>
+                  <wp:effectExtent l="0" t="0" r="5080" b="0"/>
+                  <wp:docPr id="978741937" name="Gambar 6" descr="Sebuah gambar berisi dinding, dalam ruangan, plester, plafon&#10;&#10;Konten yang dihasilkan AI mungkin salah."/>
+                  <wp:cNvGraphicFramePr>
+                    <a:graphicFrameLocks xmlns:a="http://schemas.openxmlformats.org/drawingml/2006/main" noChangeAspect="1"/>
+                  </wp:cNvGraphicFramePr>
+                  <a:graphic xmlns:a="http://schemas.openxmlformats.org/drawingml/2006/main">
+                    <a:graphicData uri="http://schemas.openxmlformats.org/drawingml/2006/picture">
+                      <pic:pic xmlns:pic="http://schemas.openxmlformats.org/drawingml/2006/picture">
+                        <pic:nvPicPr>
+                          <pic:cNvPr id="978741937" name="Gambar 6" descr="Sebuah gambar berisi dinding, dalam ruangan, plester, plafon&#10;&#10;Konten yang dihasilkan AI mungkin salah."/>
+                          <pic:cNvPicPr/>
+                        </pic:nvPicPr>
+                        <pic:blipFill rotWithShape="1">
+                          <a:blip r:embed="rId8" cstate="print">
+                            <a:extLst>
+                              <a:ext uri="{28A0092B-C50C-407E-A947-70E740481C1C}">
+                                <a14:useLocalDpi xmlns:a14="http://schemas.microsoft.com/office/drawing/2010/main" val="0"/>
+                              </a:ext>
+                            </a:extLst>
+                          </a:blip>
+                          <a:srcRect t="26787" b="6767"/>
+                          <a:stretch>
+                            <a:fillRect/>
+                          </a:stretch>
+                        </pic:blipFill>
+                        <pic:spPr bwMode="auto">
+                          <a:xfrm>
+                            <a:off x="0" y="0"/>
+                            <a:ext cx="2738120" cy="2425700"/>
+                          </a:xfrm>
+                          <a:prstGeom prst="rect">
+                            <a:avLst/>
+                          </a:prstGeom>
+                          <a:ln>
+                            <a:noFill/>
+                          </a:ln>
+                          <a:extLst>
+                            <a:ext uri="{53640926-AAD7-44D8-BBD7-CCE9431645EC}">
+                              <a14:shadowObscured xmlns:a14="http://schemas.microsoft.com/office/drawing/2010/main"/>
+                            </a:ext>
+                          </a:extLst>
+                        </pic:spPr>
+                      </pic:pic>
+                    </a:graphicData>
+                  </a:graphic>
+                </wp:inline>
+              </w:drawing>
             </w:r>
           </w:p>
         </w:tc>
@@ -1639,9 +1824,11 @@
               <w:spacing w:before="44"/>
               <w:ind w:left="114"/>
             </w:pPr>
+            <w:proofErr w:type="spellStart"/>
             <w:r>
               <w:t>Pencegahan</w:t>
             </w:r>
+            <w:proofErr w:type="spellEnd"/>
             <w:r>
               <w:rPr>
                 <w:spacing w:val="-7"/>
@@ -1657,17 +1844,74 @@
               </w:rPr>
               <w:t xml:space="preserve"> </w:t>
             </w:r>
+            <w:proofErr w:type="spellStart"/>
             <w:r>
               <w:t>penanggulangan</w:t>
             </w:r>
+            <w:proofErr w:type="spellEnd"/>
             <w:r>
               <w:rPr>
                 <w:spacing w:val="-3"/>
               </w:rPr>
               <w:t xml:space="preserve"> </w:t>
             </w:r>
+            <w:proofErr w:type="spellStart"/>
             <w:r>
               <w:t>kebakaran</w:t>
+            </w:r>
+            <w:proofErr w:type="spellEnd"/>
+          </w:p>
+          <w:p>
+            <w:pPr>
+              <w:pStyle w:val="TableParagraph"/>
+              <w:spacing w:before="44"/>
+              <w:ind w:left="114"/>
+            </w:pPr>
+            <w:r>
+              <w:rPr>
+                <w:noProof/>
+              </w:rPr>
+              <w:drawing>
+                <wp:inline distT="0" distB="0" distL="0" distR="0" wp14:anchorId="70570123" wp14:editId="1B40CBA7">
+                  <wp:extent cx="2687320" cy="3582886"/>
+                  <wp:effectExtent l="0" t="0" r="0" b="0"/>
+                  <wp:docPr id="1915349209" name="Gambar 7" descr="Sebuah gambar berisi Pemadam Api, merah, dalam ruangan&#10;&#10;Konten yang dihasilkan AI mungkin salah."/>
+                  <wp:cNvGraphicFramePr>
+                    <a:graphicFrameLocks xmlns:a="http://schemas.openxmlformats.org/drawingml/2006/main" noChangeAspect="1"/>
+                  </wp:cNvGraphicFramePr>
+                  <a:graphic xmlns:a="http://schemas.openxmlformats.org/drawingml/2006/main">
+                    <a:graphicData uri="http://schemas.openxmlformats.org/drawingml/2006/picture">
+                      <pic:pic xmlns:pic="http://schemas.openxmlformats.org/drawingml/2006/picture">
+                        <pic:nvPicPr>
+                          <pic:cNvPr id="1915349209" name="Gambar 7" descr="Sebuah gambar berisi Pemadam Api, merah, dalam ruangan&#10;&#10;Konten yang dihasilkan AI mungkin salah."/>
+                          <pic:cNvPicPr/>
+                        </pic:nvPicPr>
+                        <pic:blipFill>
+                          <a:blip r:embed="rId9" cstate="print">
+                            <a:extLst>
+                              <a:ext uri="{28A0092B-C50C-407E-A947-70E740481C1C}">
+                                <a14:useLocalDpi xmlns:a14="http://schemas.microsoft.com/office/drawing/2010/main" val="0"/>
+                              </a:ext>
+                            </a:extLst>
+                          </a:blip>
+                          <a:stretch>
+                            <a:fillRect/>
+                          </a:stretch>
+                        </pic:blipFill>
+                        <pic:spPr>
+                          <a:xfrm>
+                            <a:off x="0" y="0"/>
+                            <a:ext cx="2690650" cy="3587325"/>
+                          </a:xfrm>
+                          <a:prstGeom prst="rect">
+                            <a:avLst/>
+                          </a:prstGeom>
+                        </pic:spPr>
+                      </pic:pic>
+                    </a:graphicData>
+                  </a:graphic>
+                </wp:inline>
+              </w:drawing>
             </w:r>
           </w:p>
         </w:tc>
@@ -1784,17 +2028,67 @@
               <w:pStyle w:val="TableParagraph"/>
               <w:ind w:left="114"/>
             </w:pPr>
+            <w:proofErr w:type="spellStart"/>
             <w:r>
               <w:t>Sistem</w:t>
             </w:r>
+            <w:proofErr w:type="spellEnd"/>
             <w:r>
               <w:rPr>
                 <w:spacing w:val="-14"/>
               </w:rPr>
               <w:t xml:space="preserve"> </w:t>
             </w:r>
+            <w:proofErr w:type="spellStart"/>
             <w:r>
               <w:t>komunikasi</w:t>
+            </w:r>
+            <w:proofErr w:type="spellEnd"/>
+            <w:r>
+              <w:rPr>
+                <w:noProof/>
+              </w:rPr>
+              <w:drawing>
+                <wp:inline distT="0" distB="0" distL="0" distR="0" wp14:anchorId="075CC200" wp14:editId="1EB5A805">
+                  <wp:extent cx="2738120" cy="4870450"/>
+                  <wp:effectExtent l="0" t="0" r="5080" b="6350"/>
+                  <wp:docPr id="604750661" name="Gambar 10"/>
+                  <wp:cNvGraphicFramePr>
+                    <a:graphicFrameLocks xmlns:a="http://schemas.openxmlformats.org/drawingml/2006/main" noChangeAspect="1"/>
+                  </wp:cNvGraphicFramePr>
+                  <a:graphic xmlns:a="http://schemas.openxmlformats.org/drawingml/2006/main">
+                    <a:graphicData uri="http://schemas.openxmlformats.org/drawingml/2006/picture">
+                      <pic:pic xmlns:pic="http://schemas.openxmlformats.org/drawingml/2006/picture">
+                        <pic:nvPicPr>
+                          <pic:cNvPr id="604750661" name="Gambar 604750661"/>
+                          <pic:cNvPicPr/>
+                        </pic:nvPicPr>
+                        <pic:blipFill>
+                          <a:blip r:embed="rId10" cstate="print">
+                            <a:extLst>
+                              <a:ext uri="{28A0092B-C50C-407E-A947-70E740481C1C}">
+                                <a14:useLocalDpi xmlns:a14="http://schemas.microsoft.com/office/drawing/2010/main" val="0"/>
+                              </a:ext>
+                            </a:extLst>
+                          </a:blip>
+                          <a:stretch>
+                            <a:fillRect/>
+                          </a:stretch>
+                        </pic:blipFill>
+                        <pic:spPr>
+                          <a:xfrm>
+                            <a:off x="0" y="0"/>
+                            <a:ext cx="2738120" cy="4870450"/>
+                          </a:xfrm>
+                          <a:prstGeom prst="rect">
+                            <a:avLst/>
+                          </a:prstGeom>
+                        </pic:spPr>
+                      </pic:pic>
+                    </a:graphicData>
+                  </a:graphic>
+                </wp:inline>
+              </w:drawing>
             </w:r>
           </w:p>
         </w:tc>
@@ -1939,8 +2233,72 @@
               </w:rPr>
               <w:t xml:space="preserve"> </w:t>
             </w:r>
+            <w:proofErr w:type="spellStart"/>
             <w:r>
               <w:t>Apotek</w:t>
+            </w:r>
+            <w:proofErr w:type="spellEnd"/>
+          </w:p>
+          <w:p>
+            <w:pPr>
+              <w:pStyle w:val="TableParagraph"/>
+              <w:spacing w:before="1"/>
+              <w:ind w:left="114"/>
+            </w:pPr>
+            <w:r>
+              <w:rPr>
+                <w:noProof/>
+              </w:rPr>
+              <w:drawing>
+                <wp:inline distT="0" distB="0" distL="0" distR="0" wp14:anchorId="751FC39F" wp14:editId="61CB129B">
+                  <wp:extent cx="2738120" cy="1675765"/>
+                  <wp:effectExtent l="0" t="0" r="5080" b="635"/>
+                  <wp:docPr id="99314980" name="Gambar 8" descr="Sebuah gambar berisi teks, tanda, Papan iklan, garis&#10;&#10;Konten yang dihasilkan AI mungkin salah."/>
+                  <wp:cNvGraphicFramePr>
+                    <a:graphicFrameLocks xmlns:a="http://schemas.openxmlformats.org/drawingml/2006/main" noChangeAspect="1"/>
+                  </wp:cNvGraphicFramePr>
+                  <a:graphic xmlns:a="http://schemas.openxmlformats.org/drawingml/2006/main">
+                    <a:graphicData uri="http://schemas.openxmlformats.org/drawingml/2006/picture">
+                      <pic:pic xmlns:pic="http://schemas.openxmlformats.org/drawingml/2006/picture">
+                        <pic:nvPicPr>
+                          <pic:cNvPr id="99314980" name="Gambar 8" descr="Sebuah gambar berisi teks, tanda, Papan iklan, garis&#10;&#10;Konten yang dihasilkan AI mungkin salah."/>
+                          <pic:cNvPicPr/>
+                        </pic:nvPicPr>
+                        <pic:blipFill rotWithShape="1">
+                          <a:blip r:embed="rId11" cstate="print">
+                            <a:extLst>
+                              <a:ext uri="{28A0092B-C50C-407E-A947-70E740481C1C}">
+                                <a14:useLocalDpi xmlns:a14="http://schemas.microsoft.com/office/drawing/2010/main" val="0"/>
+                              </a:ext>
+                            </a:extLst>
+                          </a:blip>
+                          <a:srcRect t="54096"/>
+                          <a:stretch>
+                            <a:fillRect/>
+                          </a:stretch>
+                        </pic:blipFill>
+                        <pic:spPr bwMode="auto">
+                          <a:xfrm>
+                            <a:off x="0" y="0"/>
+                            <a:ext cx="2738120" cy="1675765"/>
+                          </a:xfrm>
+                          <a:prstGeom prst="rect">
+                            <a:avLst/>
+                          </a:prstGeom>
+                          <a:ln>
+                            <a:noFill/>
+                          </a:ln>
+                          <a:extLst>
+                            <a:ext uri="{53640926-AAD7-44D8-BBD7-CCE9431645EC}">
+                              <a14:shadowObscured xmlns:a14="http://schemas.microsoft.com/office/drawing/2010/main"/>
+                            </a:ext>
+                          </a:extLst>
+                        </pic:spPr>
+                      </pic:pic>
+                    </a:graphicData>
+                  </a:graphic>
+                </wp:inline>
+              </w:drawing>
             </w:r>
           </w:p>
         </w:tc>
@@ -2146,11 +2504,14 @@
             <w:pPr>
               <w:pStyle w:val="TableParagraph"/>
               <w:ind w:left="114"/>
-            </w:pPr>
-            <w:r>
               <w:rPr>
                 <w:spacing w:val="-1"/>
               </w:rPr>
+            </w:pPr>
+            <w:r>
+              <w:rPr>
+                <w:spacing w:val="-1"/>
+              </w:rPr>
               <w:t>Papan</w:t>
             </w:r>
             <w:r>
@@ -2171,23 +2532,88 @@
               </w:rPr>
               <w:t xml:space="preserve"> </w:t>
             </w:r>
+            <w:proofErr w:type="spellStart"/>
             <w:r>
               <w:rPr>
                 <w:spacing w:val="-1"/>
               </w:rPr>
               <w:t>praktik</w:t>
             </w:r>
+            <w:proofErr w:type="spellEnd"/>
             <w:r>
               <w:rPr>
                 <w:spacing w:val="-6"/>
               </w:rPr>
               <w:t xml:space="preserve"> </w:t>
             </w:r>
+            <w:proofErr w:type="spellStart"/>
             <w:r>
               <w:rPr>
                 <w:spacing w:val="-1"/>
               </w:rPr>
               <w:t>Apoteker</w:t>
+            </w:r>
+            <w:proofErr w:type="spellEnd"/>
+          </w:p>
+          <w:p>
+            <w:pPr>
+              <w:pStyle w:val="TableParagraph"/>
+              <w:ind w:left="114"/>
+            </w:pPr>
+            <w:r>
+              <w:rPr>
+                <w:noProof/>
+              </w:rPr>
+              <w:drawing>
+                <wp:inline distT="0" distB="0" distL="0" distR="0" wp14:anchorId="1D5C2B27" wp14:editId="05427690">
+                  <wp:extent cx="2738120" cy="2869565"/>
+                  <wp:effectExtent l="0" t="0" r="5080" b="6985"/>
+                  <wp:docPr id="393497782" name="Gambar 9" descr="Sebuah gambar berisi teks, dalam ruangan, alat&#10;&#10;Konten yang dihasilkan AI mungkin salah."/>
+                  <wp:cNvGraphicFramePr>
+                    <a:graphicFrameLocks xmlns:a="http://schemas.openxmlformats.org/drawingml/2006/main" noChangeAspect="1"/>
+                  </wp:cNvGraphicFramePr>
+                  <a:graphic xmlns:a="http://schemas.openxmlformats.org/drawingml/2006/main">
+                    <a:graphicData uri="http://schemas.openxmlformats.org/drawingml/2006/picture">
+                      <pic:pic xmlns:pic="http://schemas.openxmlformats.org/drawingml/2006/picture">
+                        <pic:nvPicPr>
+                          <pic:cNvPr id="393497782" name="Gambar 9" descr="Sebuah gambar berisi teks, dalam ruangan, alat&#10;&#10;Konten yang dihasilkan AI mungkin salah."/>
+                          <pic:cNvPicPr/>
+                        </pic:nvPicPr>
+                        <pic:blipFill rotWithShape="1">
+                          <a:blip r:embed="rId12" cstate="print">
+                            <a:extLst>
+                              <a:ext uri="{28A0092B-C50C-407E-A947-70E740481C1C}">
+                                <a14:useLocalDpi xmlns:a14="http://schemas.microsoft.com/office/drawing/2010/main" val="0"/>
+                              </a:ext>
+                            </a:extLst>
+                          </a:blip>
+                          <a:srcRect t="21395"/>
+                          <a:stretch>
+                            <a:fillRect/>
+                          </a:stretch>
+                        </pic:blipFill>
+                        <pic:spPr bwMode="auto">
+                          <a:xfrm>
+                            <a:off x="0" y="0"/>
+                            <a:ext cx="2738120" cy="2869565"/>
+                          </a:xfrm>
+                          <a:prstGeom prst="rect">
+                            <a:avLst/>
+                          </a:prstGeom>
+                          <a:ln>
+                            <a:noFill/>
+                          </a:ln>
+                          <a:extLst>
+                            <a:ext uri="{53640926-AAD7-44D8-BBD7-CCE9431645EC}">
+                              <a14:shadowObscured xmlns:a14="http://schemas.microsoft.com/office/drawing/2010/main"/>
+                            </a:ext>
+                          </a:extLst>
+                        </pic:spPr>
+                      </pic:pic>
+                    </a:graphicData>
+                  </a:graphic>
+                </wp:inline>
+              </w:drawing>
             </w:r>
           </w:p>
         </w:tc>
@@ -2412,11 +2838,19 @@
               </w:rPr>
               <w:t xml:space="preserve"> </w:t>
             </w:r>
+            <w:proofErr w:type="spellStart"/>
             <w:r>
               <w:rPr>
                 <w:spacing w:val="-1"/>
               </w:rPr>
-              <w:t>pendaftaran/</w:t>
+              <w:t>pendaftaran</w:t>
+            </w:r>
+            <w:proofErr w:type="spellEnd"/>
+            <w:r>
+              <w:rPr>
+                <w:spacing w:val="-1"/>
+              </w:rPr>
+              <w:t>/</w:t>
             </w:r>
             <w:r>
               <w:rPr>
@@ -2424,17 +2858,83 @@
               </w:rPr>
               <w:t xml:space="preserve"> </w:t>
             </w:r>
+            <w:proofErr w:type="spellStart"/>
             <w:r>
               <w:t>penerimaan</w:t>
             </w:r>
+            <w:proofErr w:type="spellEnd"/>
             <w:r>
               <w:rPr>
                 <w:spacing w:val="-10"/>
               </w:rPr>
               <w:t xml:space="preserve"> </w:t>
             </w:r>
+            <w:proofErr w:type="spellStart"/>
             <w:r>
               <w:t>Resep</w:t>
+            </w:r>
+            <w:proofErr w:type="spellEnd"/>
+          </w:p>
+          <w:p>
+            <w:pPr>
+              <w:pStyle w:val="TableParagraph"/>
+              <w:spacing w:before="116"/>
+              <w:ind w:left="114"/>
+            </w:pPr>
+            <w:r>
+              <w:rPr>
+                <w:noProof/>
+              </w:rPr>
+              <w:drawing>
+                <wp:inline distT="0" distB="0" distL="0" distR="0" wp14:anchorId="5C97C55F" wp14:editId="158B7F09">
+                  <wp:extent cx="2738120" cy="3446780"/>
+                  <wp:effectExtent l="0" t="0" r="5080" b="1270"/>
+                  <wp:docPr id="123442376" name="Gambar 11"/>
+                  <wp:cNvGraphicFramePr>
+                    <a:graphicFrameLocks xmlns:a="http://schemas.openxmlformats.org/drawingml/2006/main" noChangeAspect="1"/>
+                  </wp:cNvGraphicFramePr>
+                  <a:graphic xmlns:a="http://schemas.openxmlformats.org/drawingml/2006/main">
+                    <a:graphicData uri="http://schemas.openxmlformats.org/drawingml/2006/picture">
+                      <pic:pic xmlns:pic="http://schemas.openxmlformats.org/drawingml/2006/picture">
+                        <pic:nvPicPr>
+                          <pic:cNvPr id="123442376" name="Gambar 123442376"/>
+                          <pic:cNvPicPr/>
+                        </pic:nvPicPr>
+                        <pic:blipFill rotWithShape="1">
+                          <a:blip r:embed="rId13" cstate="print">
+                            <a:extLst>
+                              <a:ext uri="{28A0092B-C50C-407E-A947-70E740481C1C}">
+                                <a14:useLocalDpi xmlns:a14="http://schemas.microsoft.com/office/drawing/2010/main" val="0"/>
+                              </a:ext>
+                            </a:extLst>
+                          </a:blip>
+                          <a:srcRect l="-232" t="16234" r="232" b="-155"/>
+                          <a:stretch>
+                            <a:fillRect/>
+                          </a:stretch>
+                        </pic:blipFill>
+                        <pic:spPr bwMode="auto">
+                          <a:xfrm>
+                            <a:off x="0" y="0"/>
+                            <a:ext cx="2738120" cy="3446780"/>
+                          </a:xfrm>
+                          <a:prstGeom prst="rect">
+                            <a:avLst/>
+                          </a:prstGeom>
+                          <a:ln>
+                            <a:noFill/>
+                          </a:ln>
+                          <a:extLst>
+                            <a:ext uri="{53640926-AAD7-44D8-BBD7-CCE9431645EC}">
+                              <a14:shadowObscured xmlns:a14="http://schemas.microsoft.com/office/drawing/2010/main"/>
+                            </a:ext>
+                          </a:extLst>
+                        </pic:spPr>
+                      </pic:pic>
+                    </a:graphicData>
+                  </a:graphic>
+                </wp:inline>
+              </w:drawing>
             </w:r>
           </w:p>
         </w:tc>
@@ -2583,20 +3083,30 @@
               </w:rPr>
               <w:t xml:space="preserve"> </w:t>
             </w:r>
+            <w:proofErr w:type="spellStart"/>
             <w:r>
               <w:rPr>
                 <w:spacing w:val="-1"/>
               </w:rPr>
               <w:t>pelayanan</w:t>
             </w:r>
+            <w:proofErr w:type="spellEnd"/>
             <w:r>
               <w:rPr>
                 <w:spacing w:val="-5"/>
               </w:rPr>
               <w:t xml:space="preserve"> </w:t>
             </w:r>
-            <w:r>
-              <w:t>Resepdan</w:t>
+            <w:proofErr w:type="spellStart"/>
+            <w:r>
+              <w:t>Resep</w:t>
+            </w:r>
+            <w:proofErr w:type="spellEnd"/>
+            <w:r>
+              <w:t xml:space="preserve"> </w:t>
+            </w:r>
+            <w:r>
+              <w:t>dan</w:t>
             </w:r>
             <w:r>
               <w:rPr>
@@ -2604,8 +3114,66 @@
               </w:rPr>
               <w:t xml:space="preserve"> </w:t>
             </w:r>
+            <w:proofErr w:type="spellStart"/>
             <w:r>
               <w:t>peracikan</w:t>
+            </w:r>
+            <w:proofErr w:type="spellEnd"/>
+            <w:r>
+              <w:rPr>
+                <w:noProof/>
+              </w:rPr>
+              <w:lastRenderedPageBreak/>
+              <w:drawing>
+                <wp:inline distT="0" distB="0" distL="0" distR="0" wp14:anchorId="3FCBC259" wp14:editId="30EE9327">
+                  <wp:extent cx="2738120" cy="2926080"/>
+                  <wp:effectExtent l="0" t="0" r="5080" b="7620"/>
+                  <wp:docPr id="1232075656" name="Gambar 12" descr="Sebuah gambar berisi dalam ruangan, dinding, mebel, meja tulis&#10;&#10;Konten yang dihasilkan AI mungkin salah."/>
+                  <wp:cNvGraphicFramePr>
+                    <a:graphicFrameLocks xmlns:a="http://schemas.openxmlformats.org/drawingml/2006/main" noChangeAspect="1"/>
+                  </wp:cNvGraphicFramePr>
+                  <a:graphic xmlns:a="http://schemas.openxmlformats.org/drawingml/2006/main">
+                    <a:graphicData uri="http://schemas.openxmlformats.org/drawingml/2006/picture">
+                      <pic:pic xmlns:pic="http://schemas.openxmlformats.org/drawingml/2006/picture">
+                        <pic:nvPicPr>
+                          <pic:cNvPr id="1232075656" name="Gambar 12" descr="Sebuah gambar berisi dalam ruangan, dinding, mebel, meja tulis&#10;&#10;Konten yang dihasilkan AI mungkin salah."/>
+                          <pic:cNvPicPr/>
+                        </pic:nvPicPr>
+                        <pic:blipFill rotWithShape="1">
+                          <a:blip r:embed="rId14" cstate="print">
+                            <a:extLst>
+                              <a:ext uri="{28A0092B-C50C-407E-A947-70E740481C1C}">
+                                <a14:useLocalDpi xmlns:a14="http://schemas.microsoft.com/office/drawing/2010/main" val="0"/>
+                              </a:ext>
+                            </a:extLst>
+                          </a:blip>
+                          <a:srcRect t="28757"/>
+                          <a:stretch>
+                            <a:fillRect/>
+                          </a:stretch>
+                        </pic:blipFill>
+                        <pic:spPr bwMode="auto">
+                          <a:xfrm>
+                            <a:off x="0" y="0"/>
+                            <a:ext cx="2738120" cy="2926080"/>
+                          </a:xfrm>
+                          <a:prstGeom prst="rect">
+                            <a:avLst/>
+                          </a:prstGeom>
+                          <a:ln>
+                            <a:noFill/>
+                          </a:ln>
+                          <a:extLst>
+                            <a:ext uri="{53640926-AAD7-44D8-BBD7-CCE9431645EC}">
+                              <a14:shadowObscured xmlns:a14="http://schemas.microsoft.com/office/drawing/2010/main"/>
+                            </a:ext>
+                          </a:extLst>
+                        </pic:spPr>
+                      </pic:pic>
+                    </a:graphicData>
+                  </a:graphic>
+                </wp:inline>
+              </w:drawing>
             </w:r>
           </w:p>
         </w:tc>
@@ -2623,6 +3191,7 @@
               <w:rPr>
                 <w:spacing w:val="-1"/>
               </w:rPr>
+              <w:lastRenderedPageBreak/>
               <w:t>Sesuai</w:t>
             </w:r>
             <w:r>
@@ -10474,6 +11043,7 @@
         </w:tc>
       </w:tr>
     </w:tbl>
+    <w:p/>
     <w:p/>
     <w:sectPr>
       <w:pgSz w:w="12240" w:h="20160"/>

</xml_diff>

<commit_message>
update foto sarana dan prasarana
</commit_message>
<xml_diff>
--- a/DOKUMEN PELENGKAP/SARANA DAN PRASARANA.docx
+++ b/DOKUMEN PELENGKAP/SARANA DAN PRASARANA.docx
@@ -547,12 +547,14 @@
               <w:pStyle w:val="TableParagraph"/>
               <w:ind w:left="114"/>
             </w:pPr>
+            <w:proofErr w:type="spellStart"/>
             <w:r>
               <w:rPr>
                 <w:spacing w:val="-1"/>
               </w:rPr>
               <w:t>Sumber</w:t>
             </w:r>
+            <w:proofErr w:type="spellEnd"/>
             <w:r>
               <w:rPr>
                 <w:spacing w:val="9"/>
@@ -604,7 +606,7 @@
                 <w:noProof/>
               </w:rPr>
               <w:drawing>
-                <wp:inline distT="0" distB="0" distL="0" distR="0" wp14:anchorId="6288EA6A" wp14:editId="6B89AF82">
+                <wp:inline distT="0" distB="0" distL="0" distR="0" wp14:anchorId="6288EA6A" wp14:editId="2C98DE93">
                   <wp:extent cx="2738120" cy="3650615"/>
                   <wp:effectExtent l="0" t="0" r="5080" b="6985"/>
                   <wp:docPr id="1855289674" name="Gambar 1" descr="Sebuah gambar berisi dalam ruangan, dinding, Perlengkapan pipa, kamar mandi&#10;&#10;Konten yang dihasilkan AI mungkin salah."/>
@@ -947,7 +949,7 @@
                 <w:noProof/>
               </w:rPr>
               <w:drawing>
-                <wp:inline distT="0" distB="0" distL="0" distR="0" wp14:anchorId="55315932" wp14:editId="76DBDBBC">
+                <wp:inline distT="0" distB="0" distL="0" distR="0" wp14:anchorId="55315932" wp14:editId="769AD2E0">
                   <wp:extent cx="2738120" cy="3650615"/>
                   <wp:effectExtent l="0" t="0" r="5080" b="6985"/>
                   <wp:docPr id="1037591785" name="Gambar 2"/>
@@ -1287,7 +1289,7 @@
                 <w:noProof/>
               </w:rPr>
               <w:drawing>
-                <wp:inline distT="0" distB="0" distL="0" distR="0" wp14:anchorId="7EFA6F20" wp14:editId="4D8B5F82">
+                <wp:inline distT="0" distB="0" distL="0" distR="0" wp14:anchorId="7EFA6F20" wp14:editId="7FBC51CB">
                   <wp:extent cx="2738120" cy="1497965"/>
                   <wp:effectExtent l="0" t="0" r="5080" b="6985"/>
                   <wp:docPr id="741716667" name="Gambar 5" descr="Sebuah gambar berisi dinding, dalam ruangan, Peralatan Rumah tangga, Kipas mekanis&#10;&#10;Konten yang dihasilkan AI mungkin salah."/>
@@ -1635,7 +1637,6 @@
               <w:jc w:val="center"/>
             </w:pPr>
             <w:r>
-              <w:lastRenderedPageBreak/>
               <w:t>4</w:t>
             </w:r>
           </w:p>
@@ -1659,8 +1660,9 @@
               <w:rPr>
                 <w:noProof/>
               </w:rPr>
+              <w:lastRenderedPageBreak/>
               <w:drawing>
-                <wp:inline distT="0" distB="0" distL="0" distR="0" wp14:anchorId="4B96820B" wp14:editId="2CA83F26">
+                <wp:inline distT="0" distB="0" distL="0" distR="0" wp14:anchorId="4B96820B" wp14:editId="0C67A89D">
                   <wp:extent cx="2738120" cy="2425700"/>
                   <wp:effectExtent l="0" t="0" r="5080" b="0"/>
                   <wp:docPr id="978741937" name="Gambar 6" descr="Sebuah gambar berisi dinding, dalam ruangan, plester, plafon&#10;&#10;Konten yang dihasilkan AI mungkin salah."/>
@@ -1726,6 +1728,7 @@
               <w:rPr>
                 <w:spacing w:val="-1"/>
               </w:rPr>
+              <w:lastRenderedPageBreak/>
               <w:t>Penerangan</w:t>
             </w:r>
             <w:r>
@@ -1872,7 +1875,7 @@
                 <w:noProof/>
               </w:rPr>
               <w:drawing>
-                <wp:inline distT="0" distB="0" distL="0" distR="0" wp14:anchorId="70570123" wp14:editId="1B40CBA7">
+                <wp:inline distT="0" distB="0" distL="0" distR="0" wp14:anchorId="70570123" wp14:editId="78D487B8">
                   <wp:extent cx="2687320" cy="3582886"/>
                   <wp:effectExtent l="0" t="0" r="0" b="0"/>
                   <wp:docPr id="1915349209" name="Gambar 7" descr="Sebuah gambar berisi Pemadam Api, merah, dalam ruangan&#10;&#10;Konten yang dihasilkan AI mungkin salah."/>
@@ -2049,7 +2052,7 @@
                 <w:noProof/>
               </w:rPr>
               <w:drawing>
-                <wp:inline distT="0" distB="0" distL="0" distR="0" wp14:anchorId="075CC200" wp14:editId="1EB5A805">
+                <wp:inline distT="0" distB="0" distL="0" distR="0" wp14:anchorId="075CC200" wp14:editId="11CCCCAB">
                   <wp:extent cx="2738120" cy="4870450"/>
                   <wp:effectExtent l="0" t="0" r="5080" b="6350"/>
                   <wp:docPr id="604750661" name="Gambar 10"/>
@@ -2249,8 +2252,9 @@
               <w:rPr>
                 <w:noProof/>
               </w:rPr>
+              <w:lastRenderedPageBreak/>
               <w:drawing>
-                <wp:inline distT="0" distB="0" distL="0" distR="0" wp14:anchorId="751FC39F" wp14:editId="61CB129B">
+                <wp:inline distT="0" distB="0" distL="0" distR="0" wp14:anchorId="751FC39F" wp14:editId="62632D46">
                   <wp:extent cx="2738120" cy="1675765"/>
                   <wp:effectExtent l="0" t="0" r="5080" b="635"/>
                   <wp:docPr id="99314980" name="Gambar 8" descr="Sebuah gambar berisi teks, tanda, Papan iklan, garis&#10;&#10;Konten yang dihasilkan AI mungkin salah."/>
@@ -2316,6 +2320,7 @@
               <w:rPr>
                 <w:spacing w:val="-1"/>
               </w:rPr>
+              <w:lastRenderedPageBreak/>
               <w:t>Memuat</w:t>
             </w:r>
             <w:r>
@@ -2565,7 +2570,7 @@
                 <w:noProof/>
               </w:rPr>
               <w:drawing>
-                <wp:inline distT="0" distB="0" distL="0" distR="0" wp14:anchorId="1D5C2B27" wp14:editId="05427690">
+                <wp:inline distT="0" distB="0" distL="0" distR="0" wp14:anchorId="1D5C2B27" wp14:editId="2526F3C9">
                   <wp:extent cx="2738120" cy="2869565"/>
                   <wp:effectExtent l="0" t="0" r="5080" b="6985"/>
                   <wp:docPr id="393497782" name="Gambar 9" descr="Sebuah gambar berisi teks, dalam ruangan, alat&#10;&#10;Konten yang dihasilkan AI mungkin salah."/>
@@ -3316,6 +3321,9 @@
             <w:pPr>
               <w:pStyle w:val="TableParagraph"/>
               <w:ind w:left="114" w:right="143"/>
+              <w:rPr>
+                <w:spacing w:val="-1"/>
+              </w:rPr>
             </w:pPr>
             <w:r>
               <w:t>Ruang penyerahan dan pemberian informasi</w:t>
@@ -3391,6 +3399,67 @@
                 <w:spacing w:val="-1"/>
               </w:rPr>
               <w:t>BMHP.</w:t>
+            </w:r>
+          </w:p>
+          <w:p>
+            <w:pPr>
+              <w:pStyle w:val="TableParagraph"/>
+              <w:ind w:left="114" w:right="143"/>
+            </w:pPr>
+            <w:r>
+              <w:rPr>
+                <w:noProof/>
+              </w:rPr>
+              <w:drawing>
+                <wp:inline distT="0" distB="0" distL="0" distR="0" wp14:anchorId="54C5B8C9" wp14:editId="404EE743">
+                  <wp:extent cx="2738120" cy="3446780"/>
+                  <wp:effectExtent l="0" t="0" r="5080" b="1270"/>
+                  <wp:docPr id="1489987027" name="Gambar 11"/>
+                  <wp:cNvGraphicFramePr>
+                    <a:graphicFrameLocks xmlns:a="http://schemas.openxmlformats.org/drawingml/2006/main" noChangeAspect="1"/>
+                  </wp:cNvGraphicFramePr>
+                  <a:graphic xmlns:a="http://schemas.openxmlformats.org/drawingml/2006/main">
+                    <a:graphicData uri="http://schemas.openxmlformats.org/drawingml/2006/picture">
+                      <pic:pic xmlns:pic="http://schemas.openxmlformats.org/drawingml/2006/picture">
+                        <pic:nvPicPr>
+                          <pic:cNvPr id="123442376" name="Gambar 123442376"/>
+                          <pic:cNvPicPr/>
+                        </pic:nvPicPr>
+                        <pic:blipFill rotWithShape="1">
+                          <a:blip r:embed="rId13" cstate="print">
+                            <a:extLst>
+                              <a:ext uri="{28A0092B-C50C-407E-A947-70E740481C1C}">
+                                <a14:useLocalDpi xmlns:a14="http://schemas.microsoft.com/office/drawing/2010/main" val="0"/>
+                              </a:ext>
+                            </a:extLst>
+                          </a:blip>
+                          <a:srcRect l="-232" t="16234" r="232" b="-155"/>
+                          <a:stretch>
+                            <a:fillRect/>
+                          </a:stretch>
+                        </pic:blipFill>
+                        <pic:spPr bwMode="auto">
+                          <a:xfrm>
+                            <a:off x="0" y="0"/>
+                            <a:ext cx="2738120" cy="3446780"/>
+                          </a:xfrm>
+                          <a:prstGeom prst="rect">
+                            <a:avLst/>
+                          </a:prstGeom>
+                          <a:ln>
+                            <a:noFill/>
+                          </a:ln>
+                          <a:extLst>
+                            <a:ext uri="{53640926-AAD7-44D8-BBD7-CCE9431645EC}">
+                              <a14:shadowObscured xmlns:a14="http://schemas.microsoft.com/office/drawing/2010/main"/>
+                            </a:ext>
+                          </a:extLst>
+                        </pic:spPr>
+                      </pic:pic>
+                    </a:graphicData>
+                  </a:graphic>
+                </wp:inline>
+              </w:drawing>
             </w:r>
           </w:p>
         </w:tc>
@@ -3561,8 +3630,62 @@
               </w:rPr>
               <w:t xml:space="preserve"> </w:t>
             </w:r>
+            <w:proofErr w:type="spellStart"/>
             <w:r>
               <w:t>Konseling</w:t>
+            </w:r>
+            <w:proofErr w:type="spellEnd"/>
+          </w:p>
+          <w:p>
+            <w:pPr>
+              <w:pStyle w:val="TableParagraph"/>
+              <w:ind w:left="114"/>
+            </w:pPr>
+            <w:r>
+              <w:rPr>
+                <w:noProof/>
+              </w:rPr>
+              <w:drawing>
+                <wp:inline distT="0" distB="0" distL="0" distR="0" wp14:anchorId="410CD33A" wp14:editId="5F4CECD8">
+                  <wp:extent cx="2738120" cy="3650615"/>
+                  <wp:effectExtent l="0" t="0" r="5080" b="6985"/>
+                  <wp:docPr id="1303746706" name="Gambar 1" descr="Sebuah gambar berisi mebel, lantai, meja kopi, meja&#10;&#10;Konten yang dihasilkan AI mungkin salah."/>
+                  <wp:cNvGraphicFramePr>
+                    <a:graphicFrameLocks xmlns:a="http://schemas.openxmlformats.org/drawingml/2006/main" noChangeAspect="1"/>
+                  </wp:cNvGraphicFramePr>
+                  <a:graphic xmlns:a="http://schemas.openxmlformats.org/drawingml/2006/main">
+                    <a:graphicData uri="http://schemas.openxmlformats.org/drawingml/2006/picture">
+                      <pic:pic xmlns:pic="http://schemas.openxmlformats.org/drawingml/2006/picture">
+                        <pic:nvPicPr>
+                          <pic:cNvPr id="1303746706" name="Gambar 1" descr="Sebuah gambar berisi mebel, lantai, meja kopi, meja&#10;&#10;Konten yang dihasilkan AI mungkin salah."/>
+                          <pic:cNvPicPr/>
+                        </pic:nvPicPr>
+                        <pic:blipFill>
+                          <a:blip r:embed="rId15" cstate="print">
+                            <a:extLst>
+                              <a:ext uri="{28A0092B-C50C-407E-A947-70E740481C1C}">
+                                <a14:useLocalDpi xmlns:a14="http://schemas.microsoft.com/office/drawing/2010/main" val="0"/>
+                              </a:ext>
+                            </a:extLst>
+                          </a:blip>
+                          <a:stretch>
+                            <a:fillRect/>
+                          </a:stretch>
+                        </pic:blipFill>
+                        <pic:spPr>
+                          <a:xfrm>
+                            <a:off x="0" y="0"/>
+                            <a:ext cx="2738120" cy="3650615"/>
+                          </a:xfrm>
+                          <a:prstGeom prst="rect">
+                            <a:avLst/>
+                          </a:prstGeom>
+                        </pic:spPr>
+                      </pic:pic>
+                    </a:graphicData>
+                  </a:graphic>
+                </wp:inline>
+              </w:drawing>
             </w:r>
           </w:p>
         </w:tc>
@@ -3687,6 +3810,278 @@
           <w:p>
             <w:pPr>
               <w:pStyle w:val="TableParagraph"/>
+              <w:ind w:right="409"/>
+            </w:pPr>
+            <w:r>
+              <w:rPr>
+                <w:spacing w:val="-1"/>
+              </w:rPr>
+              <w:t>Ruang</w:t>
+            </w:r>
+            <w:r>
+              <w:rPr>
+                <w:spacing w:val="-17"/>
+              </w:rPr>
+              <w:t xml:space="preserve"> </w:t>
+            </w:r>
+            <w:proofErr w:type="spellStart"/>
+            <w:r>
+              <w:rPr>
+                <w:spacing w:val="-1"/>
+              </w:rPr>
+              <w:t>penyimpanan</w:t>
+            </w:r>
+            <w:proofErr w:type="spellEnd"/>
+            <w:r>
+              <w:rPr>
+                <w:spacing w:val="-11"/>
+              </w:rPr>
+              <w:t xml:space="preserve"> </w:t>
+            </w:r>
+            <w:proofErr w:type="spellStart"/>
+            <w:r>
+              <w:t>Sediaan</w:t>
+            </w:r>
+            <w:proofErr w:type="spellEnd"/>
+            <w:r>
+              <w:rPr>
+                <w:spacing w:val="-11"/>
+              </w:rPr>
+              <w:t xml:space="preserve"> </w:t>
+            </w:r>
+            <w:r>
+              <w:t>Farmasi,</w:t>
+            </w:r>
+            <w:r>
+              <w:rPr>
+                <w:spacing w:val="5"/>
+              </w:rPr>
+              <w:t xml:space="preserve"> </w:t>
+            </w:r>
+            <w:r>
+              <w:t>Alat</w:t>
+            </w:r>
+            <w:r>
+              <w:rPr>
+                <w:spacing w:val="-52"/>
+              </w:rPr>
+              <w:t xml:space="preserve"> </w:t>
+            </w:r>
+            <w:r>
+              <w:t>Kesehatan,</w:t>
+            </w:r>
+            <w:r>
+              <w:rPr>
+                <w:spacing w:val="14"/>
+              </w:rPr>
+              <w:t xml:space="preserve"> </w:t>
+            </w:r>
+            <w:r>
+              <w:t>dan</w:t>
+            </w:r>
+            <w:r>
+              <w:rPr>
+                <w:spacing w:val="-7"/>
+              </w:rPr>
+              <w:t xml:space="preserve"> </w:t>
+            </w:r>
+            <w:r>
+              <w:t>BMHP.</w:t>
+            </w:r>
+            <w:r>
+              <w:rPr>
+                <w:noProof/>
+              </w:rPr>
+              <w:lastRenderedPageBreak/>
+              <w:drawing>
+                <wp:inline distT="0" distB="0" distL="0" distR="0" wp14:anchorId="264C9A20" wp14:editId="45ABACB0">
+                  <wp:extent cx="2738120" cy="2735580"/>
+                  <wp:effectExtent l="0" t="0" r="5080" b="7620"/>
+                  <wp:docPr id="755456629" name="Gambar 2" descr="Sebuah gambar berisi dalam ruangan, dinding, mebel, meja tulis&#10;&#10;Konten yang dihasilkan AI mungkin salah."/>
+                  <wp:cNvGraphicFramePr>
+                    <a:graphicFrameLocks xmlns:a="http://schemas.openxmlformats.org/drawingml/2006/main" noChangeAspect="1"/>
+                  </wp:cNvGraphicFramePr>
+                  <a:graphic xmlns:a="http://schemas.openxmlformats.org/drawingml/2006/main">
+                    <a:graphicData uri="http://schemas.openxmlformats.org/drawingml/2006/picture">
+                      <pic:pic xmlns:pic="http://schemas.openxmlformats.org/drawingml/2006/picture">
+                        <pic:nvPicPr>
+                          <pic:cNvPr id="755456629" name="Gambar 2" descr="Sebuah gambar berisi dalam ruangan, dinding, mebel, meja tulis&#10;&#10;Konten yang dihasilkan AI mungkin salah."/>
+                          <pic:cNvPicPr/>
+                        </pic:nvPicPr>
+                        <pic:blipFill rotWithShape="1">
+                          <a:blip r:embed="rId14" cstate="print">
+                            <a:extLst>
+                              <a:ext uri="{28A0092B-C50C-407E-A947-70E740481C1C}">
+                                <a14:useLocalDpi xmlns:a14="http://schemas.microsoft.com/office/drawing/2010/main" val="0"/>
+                              </a:ext>
+                            </a:extLst>
+                          </a:blip>
+                          <a:srcRect t="33395"/>
+                          <a:stretch>
+                            <a:fillRect/>
+                          </a:stretch>
+                        </pic:blipFill>
+                        <pic:spPr bwMode="auto">
+                          <a:xfrm>
+                            <a:off x="0" y="0"/>
+                            <a:ext cx="2738120" cy="2735580"/>
+                          </a:xfrm>
+                          <a:prstGeom prst="rect">
+                            <a:avLst/>
+                          </a:prstGeom>
+                          <a:ln>
+                            <a:noFill/>
+                          </a:ln>
+                          <a:extLst>
+                            <a:ext uri="{53640926-AAD7-44D8-BBD7-CCE9431645EC}">
+                              <a14:shadowObscured xmlns:a14="http://schemas.microsoft.com/office/drawing/2010/main"/>
+                            </a:ext>
+                          </a:extLst>
+                        </pic:spPr>
+                      </pic:pic>
+                    </a:graphicData>
+                  </a:graphic>
+                </wp:inline>
+              </w:drawing>
+            </w:r>
+          </w:p>
+        </w:tc>
+        <w:tc>
+          <w:tcPr>
+            <w:tcW w:w="3847" w:type="dxa"/>
+          </w:tcPr>
+          <w:p>
+            <w:pPr>
+              <w:pStyle w:val="TableParagraph"/>
+              <w:spacing w:before="34"/>
+              <w:ind w:left="118" w:right="428"/>
+            </w:pPr>
+            <w:r>
+              <w:lastRenderedPageBreak/>
+              <w:t>Ruang penyimpanan harus</w:t>
+            </w:r>
+            <w:r>
+              <w:rPr>
+                <w:spacing w:val="1"/>
+              </w:rPr>
+              <w:t xml:space="preserve"> </w:t>
+            </w:r>
+            <w:r>
+              <w:t>memperhatikan kondisi sanitasi,</w:t>
+            </w:r>
+            <w:r>
+              <w:rPr>
+                <w:spacing w:val="1"/>
+              </w:rPr>
+              <w:t xml:space="preserve"> </w:t>
+            </w:r>
+            <w:r>
+              <w:t>temperatur, kelembaban, ventilasi,</w:t>
+            </w:r>
+            <w:r>
+              <w:rPr>
+                <w:spacing w:val="1"/>
+              </w:rPr>
+              <w:t xml:space="preserve"> </w:t>
+            </w:r>
+            <w:r>
+              <w:t>pemisahan untuk menjamin mutu</w:t>
+            </w:r>
+            <w:r>
+              <w:rPr>
+                <w:spacing w:val="1"/>
+              </w:rPr>
+              <w:t xml:space="preserve"> </w:t>
+            </w:r>
+            <w:r>
+              <w:rPr>
+                <w:spacing w:val="-1"/>
+              </w:rPr>
+              <w:t xml:space="preserve">Sediaan Farmasi, Alat </w:t>
+            </w:r>
+            <w:r>
+              <w:t>Kesehatan,dan</w:t>
+            </w:r>
+            <w:r>
+              <w:rPr>
+                <w:spacing w:val="-52"/>
+              </w:rPr>
+              <w:t xml:space="preserve"> </w:t>
+            </w:r>
+            <w:r>
+              <w:t>BMHP</w:t>
+            </w:r>
+            <w:r>
+              <w:rPr>
+                <w:spacing w:val="7"/>
+              </w:rPr>
+              <w:t xml:space="preserve"> </w:t>
+            </w:r>
+            <w:r>
+              <w:t>dan</w:t>
+            </w:r>
+            <w:r>
+              <w:rPr>
+                <w:spacing w:val="-8"/>
+              </w:rPr>
+              <w:t xml:space="preserve"> </w:t>
+            </w:r>
+            <w:r>
+              <w:t>keamanan</w:t>
+            </w:r>
+            <w:r>
+              <w:rPr>
+                <w:spacing w:val="-7"/>
+              </w:rPr>
+              <w:t xml:space="preserve"> </w:t>
+            </w:r>
+            <w:r>
+              <w:t>petugas.</w:t>
+            </w:r>
+          </w:p>
+        </w:tc>
+        <w:tc>
+          <w:tcPr>
+            <w:tcW w:w="793" w:type="dxa"/>
+          </w:tcPr>
+          <w:p>
+            <w:pPr>
+              <w:pStyle w:val="TableParagraph"/>
+              <w:jc w:val="center"/>
+            </w:pPr>
+            <w:r>
+              <w:sym w:font="Wingdings 2" w:char="F050"/>
+            </w:r>
+          </w:p>
+        </w:tc>
+        <w:tc>
+          <w:tcPr>
+            <w:tcW w:w="890" w:type="dxa"/>
+          </w:tcPr>
+          <w:p>
+            <w:pPr>
+              <w:pStyle w:val="TableParagraph"/>
+            </w:pPr>
+          </w:p>
+        </w:tc>
+      </w:tr>
+      <w:tr>
+        <w:trPr>
+          <w:trHeight w:val="1612"/>
+        </w:trPr>
+        <w:tc>
+          <w:tcPr>
+            <w:tcW w:w="572" w:type="dxa"/>
+            <w:tcBorders>
+              <w:top w:val="single" w:sz="4" w:space="0" w:color="000000"/>
+              <w:left w:val="single" w:sz="4" w:space="0" w:color="000000"/>
+              <w:bottom w:val="single" w:sz="4" w:space="0" w:color="000000"/>
+              <w:right w:val="single" w:sz="4" w:space="0" w:color="000000"/>
+            </w:tcBorders>
+          </w:tcPr>
+          <w:p>
+            <w:pPr>
+              <w:pStyle w:val="TableParagraph"/>
               <w:rPr>
                 <w:b/>
                 <w:sz w:val="24"/>
@@ -3696,94 +4091,174 @@
           <w:p>
             <w:pPr>
               <w:pStyle w:val="TableParagraph"/>
-              <w:spacing w:before="9"/>
               <w:rPr>
                 <w:b/>
-              </w:rPr>
-            </w:pPr>
-          </w:p>
-          <w:p>
-            <w:pPr>
-              <w:pStyle w:val="TableParagraph"/>
-              <w:ind w:left="114" w:right="409"/>
-            </w:pPr>
-            <w:r>
+                <w:sz w:val="24"/>
+              </w:rPr>
+            </w:pPr>
+          </w:p>
+          <w:p>
+            <w:pPr>
+              <w:pStyle w:val="TableParagraph"/>
+              <w:rPr>
+                <w:b/>
+                <w:sz w:val="24"/>
+              </w:rPr>
+            </w:pPr>
+            <w:r>
+              <w:rPr>
+                <w:b/>
+                <w:sz w:val="24"/>
+              </w:rPr>
+              <w:t>6</w:t>
+            </w:r>
+          </w:p>
+        </w:tc>
+        <w:tc>
+          <w:tcPr>
+            <w:tcW w:w="4322" w:type="dxa"/>
+            <w:tcBorders>
+              <w:top w:val="single" w:sz="4" w:space="0" w:color="000000"/>
+              <w:left w:val="single" w:sz="4" w:space="0" w:color="000000"/>
+              <w:bottom w:val="single" w:sz="4" w:space="0" w:color="000000"/>
+              <w:right w:val="single" w:sz="4" w:space="0" w:color="000000"/>
+            </w:tcBorders>
+          </w:tcPr>
+          <w:p>
+            <w:pPr>
+              <w:pStyle w:val="TableParagraph"/>
+              <w:spacing w:before="6"/>
+              <w:ind w:right="368"/>
+            </w:pPr>
+            <w:r>
+              <w:t>Ruang</w:t>
+            </w:r>
+            <w:r>
+              <w:rPr>
+                <w:spacing w:val="-13"/>
+              </w:rPr>
+              <w:t xml:space="preserve"> </w:t>
+            </w:r>
+            <w:proofErr w:type="spellStart"/>
+            <w:r>
+              <w:t>Penyimpanan</w:t>
+            </w:r>
+            <w:proofErr w:type="spellEnd"/>
+            <w:r>
+              <w:rPr>
+                <w:spacing w:val="-7"/>
+              </w:rPr>
+              <w:t xml:space="preserve"> </w:t>
+            </w:r>
+            <w:proofErr w:type="spellStart"/>
+            <w:r>
+              <w:t>dokumen</w:t>
+            </w:r>
+            <w:proofErr w:type="spellEnd"/>
+            <w:r>
+              <w:rPr>
+                <w:spacing w:val="-2"/>
+              </w:rPr>
+              <w:t xml:space="preserve"> </w:t>
+            </w:r>
+            <w:proofErr w:type="spellStart"/>
+            <w:r>
+              <w:t>administrasi</w:t>
+            </w:r>
+            <w:proofErr w:type="spellEnd"/>
+            <w:r>
+              <w:rPr>
+                <w:spacing w:val="-52"/>
+              </w:rPr>
+              <w:t xml:space="preserve"> </w:t>
+            </w:r>
+            <w:r>
+              <w:t>dan</w:t>
+            </w:r>
+            <w:r>
+              <w:rPr>
+                <w:spacing w:val="1"/>
+              </w:rPr>
+              <w:t xml:space="preserve"> </w:t>
+            </w:r>
+            <w:r>
+              <w:t>data</w:t>
+            </w:r>
+          </w:p>
+          <w:p>
+            <w:pPr>
+              <w:pStyle w:val="TableParagraph"/>
+              <w:ind w:right="409"/>
               <w:rPr>
                 <w:spacing w:val="-1"/>
               </w:rPr>
-              <w:t>Ruang</w:t>
-            </w:r>
-            <w:r>
-              <w:rPr>
-                <w:spacing w:val="-17"/>
-              </w:rPr>
-              <w:t xml:space="preserve"> </w:t>
-            </w:r>
-            <w:r>
-              <w:rPr>
-                <w:spacing w:val="-1"/>
-              </w:rPr>
-              <w:t>penyimpanan</w:t>
-            </w:r>
-            <w:r>
-              <w:rPr>
-                <w:spacing w:val="-11"/>
-              </w:rPr>
-              <w:t xml:space="preserve"> </w:t>
-            </w:r>
-            <w:r>
-              <w:t>Sediaan</w:t>
-            </w:r>
-            <w:r>
-              <w:rPr>
-                <w:spacing w:val="-11"/>
-              </w:rPr>
-              <w:t xml:space="preserve"> </w:t>
-            </w:r>
-            <w:r>
-              <w:t>Farmasi,</w:t>
-            </w:r>
-            <w:r>
-              <w:rPr>
-                <w:spacing w:val="5"/>
-              </w:rPr>
-              <w:t xml:space="preserve"> </w:t>
-            </w:r>
-            <w:r>
-              <w:t>Alat</w:t>
-            </w:r>
-            <w:r>
-              <w:rPr>
-                <w:spacing w:val="-52"/>
-              </w:rPr>
-              <w:t xml:space="preserve"> </w:t>
-            </w:r>
-            <w:r>
-              <w:t>Kesehatan,</w:t>
-            </w:r>
-            <w:r>
-              <w:rPr>
-                <w:spacing w:val="14"/>
-              </w:rPr>
-              <w:t xml:space="preserve"> </w:t>
-            </w:r>
-            <w:r>
-              <w:t>dan</w:t>
-            </w:r>
-            <w:r>
-              <w:rPr>
-                <w:spacing w:val="-7"/>
-              </w:rPr>
-              <w:t xml:space="preserve"> </w:t>
-            </w:r>
-            <w:r>
-              <w:t>BMHP.</w:t>
+            </w:pPr>
+            <w:r>
+              <w:rPr>
+                <w:noProof/>
+              </w:rPr>
+              <w:drawing>
+                <wp:inline distT="0" distB="0" distL="0" distR="0" wp14:anchorId="171DEB9D" wp14:editId="71E4A306">
+                  <wp:extent cx="1036622" cy="981075"/>
+                  <wp:effectExtent l="0" t="0" r="0" b="0"/>
+                  <wp:docPr id="1628762210" name="Gambar 3" descr="Sebuah gambar berisi dalam ruangan, dinding, desain interior, mebel&#10;&#10;Konten yang dihasilkan AI mungkin salah."/>
+                  <wp:cNvGraphicFramePr>
+                    <a:graphicFrameLocks xmlns:a="http://schemas.openxmlformats.org/drawingml/2006/main" noChangeAspect="1"/>
+                  </wp:cNvGraphicFramePr>
+                  <a:graphic xmlns:a="http://schemas.openxmlformats.org/drawingml/2006/main">
+                    <a:graphicData uri="http://schemas.openxmlformats.org/drawingml/2006/picture">
+                      <pic:pic xmlns:pic="http://schemas.openxmlformats.org/drawingml/2006/picture">
+                        <pic:nvPicPr>
+                          <pic:cNvPr id="833719796" name="Gambar 3" descr="Sebuah gambar berisi dalam ruangan, dinding, desain interior, mebel&#10;&#10;Konten yang dihasilkan AI mungkin salah."/>
+                          <pic:cNvPicPr/>
+                        </pic:nvPicPr>
+                        <pic:blipFill rotWithShape="1">
+                          <a:blip r:embed="rId16" cstate="print">
+                            <a:extLst>
+                              <a:ext uri="{28A0092B-C50C-407E-A947-70E740481C1C}">
+                                <a14:useLocalDpi xmlns:a14="http://schemas.microsoft.com/office/drawing/2010/main" val="0"/>
+                              </a:ext>
+                            </a:extLst>
+                          </a:blip>
+                          <a:srcRect l="46963" t="60847" r="15146" b="12167"/>
+                          <a:stretch>
+                            <a:fillRect/>
+                          </a:stretch>
+                        </pic:blipFill>
+                        <pic:spPr bwMode="auto">
+                          <a:xfrm>
+                            <a:off x="0" y="0"/>
+                            <a:ext cx="1037513" cy="981918"/>
+                          </a:xfrm>
+                          <a:prstGeom prst="rect">
+                            <a:avLst/>
+                          </a:prstGeom>
+                          <a:ln>
+                            <a:noFill/>
+                          </a:ln>
+                          <a:extLst>
+                            <a:ext uri="{53640926-AAD7-44D8-BBD7-CCE9431645EC}">
+                              <a14:shadowObscured xmlns:a14="http://schemas.microsoft.com/office/drawing/2010/main"/>
+                            </a:ext>
+                          </a:extLst>
+                        </pic:spPr>
+                      </pic:pic>
+                    </a:graphicData>
+                  </a:graphic>
+                </wp:inline>
+              </w:drawing>
             </w:r>
           </w:p>
         </w:tc>
         <w:tc>
           <w:tcPr>
             <w:tcW w:w="3847" w:type="dxa"/>
+            <w:tcBorders>
+              <w:top w:val="single" w:sz="4" w:space="0" w:color="000000"/>
+              <w:left w:val="single" w:sz="4" w:space="0" w:color="000000"/>
+              <w:bottom w:val="single" w:sz="4" w:space="0" w:color="000000"/>
+              <w:right w:val="single" w:sz="4" w:space="0" w:color="000000"/>
+            </w:tcBorders>
           </w:tcPr>
           <w:p>
             <w:pPr>
@@ -3791,255 +4266,16 @@
               <w:spacing w:before="34"/>
               <w:ind w:left="118" w:right="428"/>
             </w:pPr>
-            <w:r>
-              <w:t>Ruang penyimpanan harus</w:t>
-            </w:r>
-            <w:r>
-              <w:rPr>
-                <w:spacing w:val="1"/>
-              </w:rPr>
-              <w:t xml:space="preserve"> </w:t>
-            </w:r>
-            <w:r>
-              <w:t>memperhatikan kondisi sanitasi,</w:t>
-            </w:r>
-            <w:r>
-              <w:rPr>
-                <w:spacing w:val="1"/>
-              </w:rPr>
-              <w:t xml:space="preserve"> </w:t>
-            </w:r>
-            <w:r>
-              <w:t>temperatur, kelembaban, ventilasi,</w:t>
-            </w:r>
-            <w:r>
-              <w:rPr>
-                <w:spacing w:val="1"/>
-              </w:rPr>
-              <w:t xml:space="preserve"> </w:t>
-            </w:r>
-            <w:r>
-              <w:t>pemisahan untuk menjamin mutu</w:t>
-            </w:r>
-            <w:r>
-              <w:rPr>
-                <w:spacing w:val="1"/>
-              </w:rPr>
-              <w:t xml:space="preserve"> </w:t>
-            </w:r>
-            <w:r>
-              <w:rPr>
-                <w:spacing w:val="-1"/>
-              </w:rPr>
-              <w:t xml:space="preserve">Sediaan Farmasi, Alat </w:t>
-            </w:r>
-            <w:r>
-              <w:t>Kesehatan,dan</w:t>
-            </w:r>
-            <w:r>
-              <w:rPr>
-                <w:spacing w:val="-52"/>
-              </w:rPr>
-              <w:t xml:space="preserve"> </w:t>
-            </w:r>
-            <w:r>
-              <w:t>BMHP</w:t>
-            </w:r>
-            <w:r>
-              <w:rPr>
-                <w:spacing w:val="7"/>
-              </w:rPr>
-              <w:t xml:space="preserve"> </w:t>
-            </w:r>
-            <w:r>
-              <w:t>dan</w:t>
-            </w:r>
-            <w:r>
-              <w:rPr>
-                <w:spacing w:val="-8"/>
-              </w:rPr>
-              <w:t xml:space="preserve"> </w:t>
-            </w:r>
-            <w:r>
-              <w:t>keamanan</w:t>
-            </w:r>
-            <w:r>
-              <w:rPr>
-                <w:spacing w:val="-7"/>
-              </w:rPr>
-              <w:t xml:space="preserve"> </w:t>
-            </w:r>
-            <w:r>
-              <w:t>petugas.</w:t>
-            </w:r>
-          </w:p>
-        </w:tc>
-        <w:tc>
-          <w:tcPr>
-            <w:tcW w:w="793" w:type="dxa"/>
-          </w:tcPr>
-          <w:p>
-            <w:pPr>
-              <w:pStyle w:val="TableParagraph"/>
-              <w:jc w:val="center"/>
-            </w:pPr>
-            <w:r>
-              <w:sym w:font="Wingdings 2" w:char="F050"/>
-            </w:r>
-          </w:p>
-        </w:tc>
-        <w:tc>
-          <w:tcPr>
-            <w:tcW w:w="890" w:type="dxa"/>
-          </w:tcPr>
-          <w:p>
-            <w:pPr>
-              <w:pStyle w:val="TableParagraph"/>
-            </w:pPr>
-          </w:p>
-        </w:tc>
-      </w:tr>
-    </w:tbl>
-    <w:p>
-      <w:pPr>
-        <w:sectPr>
-          <w:pgSz w:w="12240" w:h="20160"/>
-          <w:pgMar w:top="1320" w:right="280" w:bottom="280" w:left="1320" w:header="720" w:footer="720" w:gutter="0"/>
-          <w:cols w:space="720"/>
-        </w:sectPr>
-      </w:pPr>
-    </w:p>
-    <w:tbl>
-      <w:tblPr>
-        <w:tblW w:w="0" w:type="auto"/>
-        <w:tblInd w:w="111" w:type="dxa"/>
-        <w:tblBorders>
-          <w:top w:val="single" w:sz="4" w:space="0" w:color="000000"/>
-          <w:left w:val="single" w:sz="4" w:space="0" w:color="000000"/>
-          <w:bottom w:val="single" w:sz="4" w:space="0" w:color="000000"/>
-          <w:right w:val="single" w:sz="4" w:space="0" w:color="000000"/>
-          <w:insideH w:val="single" w:sz="4" w:space="0" w:color="000000"/>
-          <w:insideV w:val="single" w:sz="4" w:space="0" w:color="000000"/>
-        </w:tblBorders>
-        <w:tblLayout w:type="fixed"/>
-        <w:tblCellMar>
-          <w:left w:w="0" w:type="dxa"/>
-          <w:right w:w="0" w:type="dxa"/>
-        </w:tblCellMar>
-        <w:tblLook w:val="01E0" w:firstRow="1" w:lastRow="1" w:firstColumn="1" w:lastColumn="1" w:noHBand="0" w:noVBand="0"/>
-      </w:tblPr>
-      <w:tblGrid>
-        <w:gridCol w:w="572"/>
-        <w:gridCol w:w="4322"/>
-        <w:gridCol w:w="3847"/>
-        <w:gridCol w:w="793"/>
-        <w:gridCol w:w="890"/>
-      </w:tblGrid>
-      <w:tr>
-        <w:trPr>
-          <w:trHeight w:val="566"/>
-        </w:trPr>
-        <w:tc>
-          <w:tcPr>
-            <w:tcW w:w="572" w:type="dxa"/>
-            <w:tcBorders>
-              <w:top w:val="nil"/>
-            </w:tcBorders>
-          </w:tcPr>
-          <w:p>
-            <w:pPr>
-              <w:pStyle w:val="TableParagraph"/>
-              <w:spacing w:before="131"/>
-              <w:ind w:left="18"/>
-              <w:jc w:val="center"/>
-            </w:pPr>
-            <w:r>
-              <w:lastRenderedPageBreak/>
-              <w:t>6</w:t>
-            </w:r>
-          </w:p>
-        </w:tc>
-        <w:tc>
-          <w:tcPr>
-            <w:tcW w:w="4322" w:type="dxa"/>
-            <w:tcBorders>
-              <w:top w:val="nil"/>
-            </w:tcBorders>
-          </w:tcPr>
-          <w:p>
-            <w:pPr>
-              <w:pStyle w:val="TableParagraph"/>
-              <w:spacing w:before="6"/>
-              <w:ind w:left="114" w:right="368"/>
-            </w:pPr>
-            <w:r>
-              <w:t>Ruang</w:t>
-            </w:r>
-            <w:r>
-              <w:rPr>
-                <w:spacing w:val="-13"/>
-              </w:rPr>
-              <w:t xml:space="preserve"> </w:t>
-            </w:r>
-            <w:r>
-              <w:t>Penyimpanan</w:t>
-            </w:r>
-            <w:r>
-              <w:rPr>
-                <w:spacing w:val="-7"/>
-              </w:rPr>
-              <w:t xml:space="preserve"> </w:t>
-            </w:r>
-            <w:r>
-              <w:t>dokumen</w:t>
-            </w:r>
-            <w:r>
-              <w:rPr>
-                <w:spacing w:val="-2"/>
-              </w:rPr>
-              <w:t xml:space="preserve"> </w:t>
-            </w:r>
-            <w:r>
-              <w:t>administrasi</w:t>
-            </w:r>
-            <w:r>
-              <w:rPr>
-                <w:spacing w:val="-52"/>
-              </w:rPr>
-              <w:t xml:space="preserve"> </w:t>
-            </w:r>
-            <w:r>
-              <w:t>dan</w:t>
-            </w:r>
-            <w:r>
-              <w:rPr>
-                <w:spacing w:val="1"/>
-              </w:rPr>
-              <w:t xml:space="preserve"> </w:t>
-            </w:r>
-            <w:r>
-              <w:t>data</w:t>
-            </w:r>
-          </w:p>
-        </w:tc>
-        <w:tc>
-          <w:tcPr>
-            <w:tcW w:w="3847" w:type="dxa"/>
-            <w:tcBorders>
-              <w:top w:val="nil"/>
-            </w:tcBorders>
-          </w:tcPr>
-          <w:p>
-            <w:pPr>
-              <w:pStyle w:val="TableParagraph"/>
-            </w:pPr>
           </w:p>
         </w:tc>
         <w:tc>
           <w:tcPr>
             <w:tcW w:w="793" w:type="dxa"/>
             <w:tcBorders>
-              <w:top w:val="nil"/>
+              <w:top w:val="single" w:sz="4" w:space="0" w:color="000000"/>
+              <w:left w:val="single" w:sz="4" w:space="0" w:color="000000"/>
+              <w:bottom w:val="single" w:sz="4" w:space="0" w:color="000000"/>
+              <w:right w:val="single" w:sz="4" w:space="0" w:color="000000"/>
             </w:tcBorders>
           </w:tcPr>
           <w:p>
@@ -4056,7 +4292,10 @@
           <w:tcPr>
             <w:tcW w:w="890" w:type="dxa"/>
             <w:tcBorders>
-              <w:top w:val="nil"/>
+              <w:top w:val="single" w:sz="4" w:space="0" w:color="000000"/>
+              <w:left w:val="single" w:sz="4" w:space="0" w:color="000000"/>
+              <w:bottom w:val="single" w:sz="4" w:space="0" w:color="000000"/>
+              <w:right w:val="single" w:sz="4" w:space="0" w:color="000000"/>
             </w:tcBorders>
           </w:tcPr>
           <w:p>
@@ -4085,12 +4324,20 @@
               </w:rPr>
             </w:pPr>
             <w:r>
+              <w:t xml:space="preserve"> </w:t>
+            </w:r>
+            <w:proofErr w:type="spellStart"/>
+            <w:r>
+              <w:t>P</w:t>
+            </w:r>
+            <w:r>
               <w:rPr>
                 <w:b/>
                 <w:spacing w:val="-1"/>
               </w:rPr>
-              <w:t>Peralatan</w:t>
-            </w:r>
+              <w:t>eralatan</w:t>
+            </w:r>
+            <w:proofErr w:type="spellEnd"/>
             <w:r>
               <w:rPr>
                 <w:b/>
@@ -4098,12 +4345,14 @@
               </w:rPr>
               <w:t xml:space="preserve"> </w:t>
             </w:r>
+            <w:proofErr w:type="spellStart"/>
             <w:r>
               <w:rPr>
                 <w:b/>
               </w:rPr>
               <w:t>Apotek</w:t>
             </w:r>
+            <w:proofErr w:type="spellEnd"/>
           </w:p>
         </w:tc>
       </w:tr>
@@ -4242,18 +4491,12 @@
           <w:p>
             <w:pPr>
               <w:pStyle w:val="TableParagraph"/>
+              <w:numPr>
+                <w:ilvl w:val="0"/>
+                <w:numId w:val="2"/>
+              </w:numPr>
               <w:spacing w:before="34"/>
-              <w:ind w:left="114"/>
-            </w:pPr>
-            <w:r>
-              <w:t>a.</w:t>
-            </w:r>
-            <w:r>
-              <w:rPr>
-                <w:spacing w:val="-7"/>
-              </w:rPr>
-              <w:t xml:space="preserve"> </w:t>
-            </w:r>
+            </w:pPr>
             <w:r>
               <w:t>Meja</w:t>
             </w:r>
@@ -4272,8 +4515,72 @@
               </w:rPr>
               <w:t xml:space="preserve"> </w:t>
             </w:r>
+            <w:proofErr w:type="spellStart"/>
             <w:r>
               <w:t>kursi</w:t>
+            </w:r>
+            <w:proofErr w:type="spellEnd"/>
+          </w:p>
+          <w:p>
+            <w:pPr>
+              <w:pStyle w:val="TableParagraph"/>
+              <w:spacing w:before="34"/>
+              <w:ind w:left="474"/>
+            </w:pPr>
+            <w:r>
+              <w:rPr>
+                <w:noProof/>
+              </w:rPr>
+              <w:drawing>
+                <wp:inline distT="0" distB="0" distL="0" distR="0" wp14:anchorId="6D69D368" wp14:editId="2BC1A040">
+                  <wp:extent cx="2738120" cy="2652091"/>
+                  <wp:effectExtent l="0" t="0" r="5080" b="0"/>
+                  <wp:docPr id="1240975274" name="Gambar 7" descr="Sebuah gambar berisi dalam ruangan, dinding, mebel, meja tulis&#10;&#10;Konten yang dihasilkan AI mungkin salah."/>
+                  <wp:cNvGraphicFramePr>
+                    <a:graphicFrameLocks xmlns:a="http://schemas.openxmlformats.org/drawingml/2006/main" noChangeAspect="1"/>
+                  </wp:cNvGraphicFramePr>
+                  <a:graphic xmlns:a="http://schemas.openxmlformats.org/drawingml/2006/main">
+                    <a:graphicData uri="http://schemas.openxmlformats.org/drawingml/2006/picture">
+                      <pic:pic xmlns:pic="http://schemas.openxmlformats.org/drawingml/2006/picture">
+                        <pic:nvPicPr>
+                          <pic:cNvPr id="1240975274" name="Gambar 7" descr="Sebuah gambar berisi dalam ruangan, dinding, mebel, meja tulis&#10;&#10;Konten yang dihasilkan AI mungkin salah."/>
+                          <pic:cNvPicPr/>
+                        </pic:nvPicPr>
+                        <pic:blipFill rotWithShape="1">
+                          <a:blip r:embed="rId14" cstate="print">
+                            <a:extLst>
+                              <a:ext uri="{28A0092B-C50C-407E-A947-70E740481C1C}">
+                                <a14:useLocalDpi xmlns:a14="http://schemas.microsoft.com/office/drawing/2010/main" val="0"/>
+                              </a:ext>
+                            </a:extLst>
+                          </a:blip>
+                          <a:srcRect t="35428"/>
+                          <a:stretch>
+                            <a:fillRect/>
+                          </a:stretch>
+                        </pic:blipFill>
+                        <pic:spPr bwMode="auto">
+                          <a:xfrm>
+                            <a:off x="0" y="0"/>
+                            <a:ext cx="2738120" cy="2652091"/>
+                          </a:xfrm>
+                          <a:prstGeom prst="rect">
+                            <a:avLst/>
+                          </a:prstGeom>
+                          <a:ln>
+                            <a:noFill/>
+                          </a:ln>
+                          <a:extLst>
+                            <a:ext uri="{53640926-AAD7-44D8-BBD7-CCE9431645EC}">
+                              <a14:shadowObscured xmlns:a14="http://schemas.microsoft.com/office/drawing/2010/main"/>
+                            </a:ext>
+                          </a:extLst>
+                        </pic:spPr>
+                      </pic:pic>
+                    </a:graphicData>
+                  </a:graphic>
+                </wp:inline>
+              </w:drawing>
             </w:r>
           </w:p>
         </w:tc>
@@ -4356,20 +4663,81 @@
           <w:p>
             <w:pPr>
               <w:pStyle w:val="TableParagraph"/>
+              <w:numPr>
+                <w:ilvl w:val="0"/>
+                <w:numId w:val="2"/>
+              </w:numPr>
               <w:spacing w:before="34"/>
-              <w:ind w:left="114"/>
-            </w:pPr>
-            <w:r>
-              <w:t>b.</w:t>
-            </w:r>
-            <w:r>
-              <w:rPr>
-                <w:spacing w:val="-7"/>
-              </w:rPr>
-              <w:t xml:space="preserve"> </w:t>
-            </w:r>
-            <w:r>
-              <w:t>Komputer/laptop</w:t>
+            </w:pPr>
+            <w:proofErr w:type="spellStart"/>
+            <w:r>
+              <w:t>Komputer</w:t>
+            </w:r>
+            <w:proofErr w:type="spellEnd"/>
+            <w:r>
+              <w:t>/laptop</w:t>
+            </w:r>
+          </w:p>
+          <w:p>
+            <w:pPr>
+              <w:pStyle w:val="TableParagraph"/>
+              <w:spacing w:before="34"/>
+              <w:ind w:left="474"/>
+            </w:pPr>
+            <w:r>
+              <w:rPr>
+                <w:noProof/>
+              </w:rPr>
+              <w:drawing>
+                <wp:inline distT="0" distB="0" distL="0" distR="0" wp14:anchorId="5BDC9B8B" wp14:editId="57C4962A">
+                  <wp:extent cx="2738120" cy="3224585"/>
+                  <wp:effectExtent l="0" t="0" r="5080" b="0"/>
+                  <wp:docPr id="284248536" name="Gambar 6" descr="Sebuah gambar berisi komputer, computer, dalam ruangan, dinding&#10;&#10;Konten yang dihasilkan AI mungkin salah."/>
+                  <wp:cNvGraphicFramePr>
+                    <a:graphicFrameLocks xmlns:a="http://schemas.openxmlformats.org/drawingml/2006/main" noChangeAspect="1"/>
+                  </wp:cNvGraphicFramePr>
+                  <a:graphic xmlns:a="http://schemas.openxmlformats.org/drawingml/2006/main">
+                    <a:graphicData uri="http://schemas.openxmlformats.org/drawingml/2006/picture">
+                      <pic:pic xmlns:pic="http://schemas.openxmlformats.org/drawingml/2006/picture">
+                        <pic:nvPicPr>
+                          <pic:cNvPr id="284248536" name="Gambar 6" descr="Sebuah gambar berisi komputer, computer, dalam ruangan, dinding&#10;&#10;Konten yang dihasilkan AI mungkin salah."/>
+                          <pic:cNvPicPr/>
+                        </pic:nvPicPr>
+                        <pic:blipFill rotWithShape="1">
+                          <a:blip r:embed="rId17" cstate="print">
+                            <a:extLst>
+                              <a:ext uri="{28A0092B-C50C-407E-A947-70E740481C1C}">
+                                <a14:useLocalDpi xmlns:a14="http://schemas.microsoft.com/office/drawing/2010/main" val="0"/>
+                              </a:ext>
+                            </a:extLst>
+                          </a:blip>
+                          <a:srcRect t="21489"/>
+                          <a:stretch>
+                            <a:fillRect/>
+                          </a:stretch>
+                        </pic:blipFill>
+                        <pic:spPr bwMode="auto">
+                          <a:xfrm>
+                            <a:off x="0" y="0"/>
+                            <a:ext cx="2738120" cy="3224585"/>
+                          </a:xfrm>
+                          <a:prstGeom prst="rect">
+                            <a:avLst/>
+                          </a:prstGeom>
+                          <a:ln>
+                            <a:noFill/>
+                          </a:ln>
+                          <a:extLst>
+                            <a:ext uri="{53640926-AAD7-44D8-BBD7-CCE9431645EC}">
+                              <a14:shadowObscured xmlns:a14="http://schemas.microsoft.com/office/drawing/2010/main"/>
+                            </a:ext>
+                          </a:extLst>
+                        </pic:spPr>
+                      </pic:pic>
+                    </a:graphicData>
+                  </a:graphic>
+                </wp:inline>
+              </w:drawing>
             </w:r>
           </w:p>
         </w:tc>
@@ -4693,35 +5061,250 @@
               </w:rPr>
               <w:t xml:space="preserve"> </w:t>
             </w:r>
+            <w:proofErr w:type="spellStart"/>
             <w:r>
               <w:t>dengan</w:t>
             </w:r>
+            <w:proofErr w:type="spellEnd"/>
             <w:r>
               <w:rPr>
                 <w:spacing w:val="-10"/>
               </w:rPr>
               <w:t xml:space="preserve"> </w:t>
             </w:r>
+            <w:proofErr w:type="spellStart"/>
             <w:r>
               <w:t>tanda</w:t>
             </w:r>
+            <w:proofErr w:type="spellEnd"/>
             <w:r>
               <w:rPr>
                 <w:spacing w:val="-52"/>
               </w:rPr>
               <w:t xml:space="preserve"> </w:t>
             </w:r>
+            <w:proofErr w:type="spellStart"/>
             <w:r>
               <w:t>bukti</w:t>
             </w:r>
+            <w:proofErr w:type="spellEnd"/>
             <w:r>
               <w:rPr>
                 <w:spacing w:val="2"/>
               </w:rPr>
               <w:t xml:space="preserve"> </w:t>
             </w:r>
-            <w:r>
-              <w:t>kalibrasi.</w:t>
+            <w:proofErr w:type="spellStart"/>
+            <w:r>
+              <w:t>kalibrasi</w:t>
+            </w:r>
+            <w:proofErr w:type="spellEnd"/>
+            <w:r>
+              <w:t>.</w:t>
+            </w:r>
+          </w:p>
+          <w:p>
+            <w:pPr>
+              <w:pStyle w:val="TableParagraph"/>
+              <w:spacing w:line="250" w:lineRule="exact"/>
+              <w:ind w:left="335" w:right="412"/>
+            </w:pPr>
+            <w:r>
+              <w:lastRenderedPageBreak/>
+              <w:t>\</w:t>
+            </w:r>
+          </w:p>
+          <w:p>
+            <w:pPr>
+              <w:pStyle w:val="TableParagraph"/>
+              <w:spacing w:line="250" w:lineRule="exact"/>
+              <w:ind w:left="335" w:right="412"/>
+            </w:pPr>
+          </w:p>
+          <w:p>
+            <w:pPr>
+              <w:pStyle w:val="TableParagraph"/>
+              <w:spacing w:line="250" w:lineRule="exact"/>
+              <w:ind w:left="335" w:right="412"/>
+            </w:pPr>
+          </w:p>
+          <w:p>
+            <w:pPr>
+              <w:pStyle w:val="TableParagraph"/>
+              <w:spacing w:line="250" w:lineRule="exact"/>
+              <w:ind w:left="335" w:right="412"/>
+            </w:pPr>
+          </w:p>
+          <w:p>
+            <w:pPr>
+              <w:pStyle w:val="TableParagraph"/>
+              <w:spacing w:line="250" w:lineRule="exact"/>
+              <w:ind w:left="335" w:right="412"/>
+            </w:pPr>
+          </w:p>
+          <w:p>
+            <w:pPr>
+              <w:pStyle w:val="TableParagraph"/>
+              <w:spacing w:line="250" w:lineRule="exact"/>
+              <w:ind w:left="335" w:right="412"/>
+            </w:pPr>
+          </w:p>
+          <w:p>
+            <w:pPr>
+              <w:pStyle w:val="TableParagraph"/>
+              <w:spacing w:line="250" w:lineRule="exact"/>
+              <w:ind w:left="335" w:right="412"/>
+            </w:pPr>
+          </w:p>
+          <w:p>
+            <w:pPr>
+              <w:pStyle w:val="TableParagraph"/>
+              <w:spacing w:line="250" w:lineRule="exact"/>
+              <w:ind w:left="335" w:right="412"/>
+            </w:pPr>
+          </w:p>
+          <w:p>
+            <w:pPr>
+              <w:pStyle w:val="TableParagraph"/>
+              <w:spacing w:line="250" w:lineRule="exact"/>
+              <w:ind w:left="335" w:right="412"/>
+            </w:pPr>
+          </w:p>
+          <w:p>
+            <w:pPr>
+              <w:pStyle w:val="TableParagraph"/>
+              <w:spacing w:line="250" w:lineRule="exact"/>
+              <w:ind w:left="335" w:right="412"/>
+            </w:pPr>
+          </w:p>
+          <w:p>
+            <w:pPr>
+              <w:pStyle w:val="TableParagraph"/>
+              <w:spacing w:line="250" w:lineRule="exact"/>
+              <w:ind w:left="335" w:right="412"/>
+            </w:pPr>
+          </w:p>
+          <w:p>
+            <w:pPr>
+              <w:pStyle w:val="TableParagraph"/>
+              <w:spacing w:line="250" w:lineRule="exact"/>
+              <w:ind w:left="335" w:right="412"/>
+            </w:pPr>
+          </w:p>
+          <w:p>
+            <w:pPr>
+              <w:pStyle w:val="TableParagraph"/>
+              <w:spacing w:line="250" w:lineRule="exact"/>
+              <w:ind w:left="335" w:right="412"/>
+            </w:pPr>
+          </w:p>
+          <w:p>
+            <w:pPr>
+              <w:pStyle w:val="TableParagraph"/>
+              <w:spacing w:line="250" w:lineRule="exact"/>
+              <w:ind w:left="335" w:right="412"/>
+            </w:pPr>
+          </w:p>
+          <w:p>
+            <w:pPr>
+              <w:pStyle w:val="TableParagraph"/>
+              <w:spacing w:line="250" w:lineRule="exact"/>
+              <w:ind w:left="335" w:right="412"/>
+            </w:pPr>
+          </w:p>
+          <w:p>
+            <w:pPr>
+              <w:pStyle w:val="TableParagraph"/>
+              <w:spacing w:line="250" w:lineRule="exact"/>
+              <w:ind w:left="335" w:right="412"/>
+            </w:pPr>
+          </w:p>
+          <w:p>
+            <w:pPr>
+              <w:pStyle w:val="TableParagraph"/>
+              <w:spacing w:line="250" w:lineRule="exact"/>
+              <w:ind w:left="335" w:right="412"/>
+            </w:pPr>
+          </w:p>
+          <w:p>
+            <w:pPr>
+              <w:pStyle w:val="TableParagraph"/>
+              <w:spacing w:line="250" w:lineRule="exact"/>
+              <w:ind w:left="335" w:right="412"/>
+            </w:pPr>
+          </w:p>
+          <w:p>
+            <w:pPr>
+              <w:pStyle w:val="TableParagraph"/>
+              <w:spacing w:line="250" w:lineRule="exact"/>
+              <w:ind w:left="335" w:right="412"/>
+            </w:pPr>
+          </w:p>
+          <w:p>
+            <w:pPr>
+              <w:pStyle w:val="TableParagraph"/>
+              <w:spacing w:line="250" w:lineRule="exact"/>
+              <w:ind w:left="335" w:right="412"/>
+            </w:pPr>
+          </w:p>
+          <w:p>
+            <w:pPr>
+              <w:pStyle w:val="TableParagraph"/>
+              <w:spacing w:line="250" w:lineRule="exact"/>
+              <w:ind w:left="335" w:right="412"/>
+            </w:pPr>
+          </w:p>
+          <w:p>
+            <w:pPr>
+              <w:pStyle w:val="TableParagraph"/>
+              <w:spacing w:line="250" w:lineRule="exact"/>
+              <w:ind w:left="335" w:right="412"/>
+            </w:pPr>
+            <w:r>
+              <w:rPr>
+                <w:noProof/>
+              </w:rPr>
+              <w:drawing>
+                <wp:inline distT="0" distB="0" distL="0" distR="0" wp14:anchorId="73F0E29B" wp14:editId="67FFB4B6">
+                  <wp:extent cx="2738120" cy="3638550"/>
+                  <wp:effectExtent l="0" t="0" r="5080" b="0"/>
+                  <wp:docPr id="1113442019" name="Gambar 8" descr="Sebuah gambar berisi dalam ruangan, dinding, desain interior, mebel&#10;&#10;Konten yang dihasilkan AI mungkin salah."/>
+                  <wp:cNvGraphicFramePr>
+                    <a:graphicFrameLocks xmlns:a="http://schemas.openxmlformats.org/drawingml/2006/main" noChangeAspect="1"/>
+                  </wp:cNvGraphicFramePr>
+                  <a:graphic xmlns:a="http://schemas.openxmlformats.org/drawingml/2006/main">
+                    <a:graphicData uri="http://schemas.openxmlformats.org/drawingml/2006/picture">
+                      <pic:pic xmlns:pic="http://schemas.openxmlformats.org/drawingml/2006/picture">
+                        <pic:nvPicPr>
+                          <pic:cNvPr id="1113442019" name="Gambar 8" descr="Sebuah gambar berisi dalam ruangan, dinding, desain interior, mebel&#10;&#10;Konten yang dihasilkan AI mungkin salah."/>
+                          <pic:cNvPicPr/>
+                        </pic:nvPicPr>
+                        <pic:blipFill>
+                          <a:blip r:embed="rId16" cstate="print">
+                            <a:extLst>
+                              <a:ext uri="{28A0092B-C50C-407E-A947-70E740481C1C}">
+                                <a14:useLocalDpi xmlns:a14="http://schemas.microsoft.com/office/drawing/2010/main" val="0"/>
+                              </a:ext>
+                            </a:extLst>
+                          </a:blip>
+                          <a:stretch>
+                            <a:fillRect/>
+                          </a:stretch>
+                        </pic:blipFill>
+                        <pic:spPr>
+                          <a:xfrm>
+                            <a:off x="0" y="0"/>
+                            <a:ext cx="2738120" cy="3638550"/>
+                          </a:xfrm>
+                          <a:prstGeom prst="rect">
+                            <a:avLst/>
+                          </a:prstGeom>
+                        </pic:spPr>
+                      </pic:pic>
+                    </a:graphicData>
+                  </a:graphic>
+                </wp:inline>
+              </w:drawing>
             </w:r>
           </w:p>
         </w:tc>
@@ -4914,20 +5497,78 @@
           <w:p>
             <w:pPr>
               <w:pStyle w:val="TableParagraph"/>
+              <w:numPr>
+                <w:ilvl w:val="0"/>
+                <w:numId w:val="2"/>
+              </w:numPr>
               <w:spacing w:before="44"/>
-              <w:ind w:left="114"/>
-            </w:pPr>
-            <w:r>
-              <w:t>c.</w:t>
-            </w:r>
-            <w:r>
-              <w:rPr>
-                <w:spacing w:val="-1"/>
-              </w:rPr>
-              <w:t xml:space="preserve"> </w:t>
-            </w:r>
+            </w:pPr>
+            <w:proofErr w:type="spellStart"/>
             <w:r>
               <w:t>Wastafel</w:t>
+            </w:r>
+            <w:proofErr w:type="spellEnd"/>
+          </w:p>
+          <w:p>
+            <w:pPr>
+              <w:pStyle w:val="TableParagraph"/>
+              <w:spacing w:before="44"/>
+              <w:ind w:left="474"/>
+            </w:pPr>
+            <w:r>
+              <w:rPr>
+                <w:noProof/>
+              </w:rPr>
+              <w:drawing>
+                <wp:inline distT="0" distB="0" distL="0" distR="0" wp14:anchorId="087AF755" wp14:editId="50084303">
+                  <wp:extent cx="2737922" cy="2067339"/>
+                  <wp:effectExtent l="0" t="0" r="5715" b="9525"/>
+                  <wp:docPr id="394829246" name="Gambar 9" descr="Sebuah gambar berisi dalam ruangan, dinding, Perlengkapan pipa, kamar mandi&#10;&#10;Konten yang dihasilkan AI mungkin salah."/>
+                  <wp:cNvGraphicFramePr>
+                    <a:graphicFrameLocks xmlns:a="http://schemas.openxmlformats.org/drawingml/2006/main" noChangeAspect="1"/>
+                  </wp:cNvGraphicFramePr>
+                  <a:graphic xmlns:a="http://schemas.openxmlformats.org/drawingml/2006/main">
+                    <a:graphicData uri="http://schemas.openxmlformats.org/drawingml/2006/picture">
+                      <pic:pic xmlns:pic="http://schemas.openxmlformats.org/drawingml/2006/picture">
+                        <pic:nvPicPr>
+                          <pic:cNvPr id="394829246" name="Gambar 9" descr="Sebuah gambar berisi dalam ruangan, dinding, Perlengkapan pipa, kamar mandi&#10;&#10;Konten yang dihasilkan AI mungkin salah."/>
+                          <pic:cNvPicPr/>
+                        </pic:nvPicPr>
+                        <pic:blipFill rotWithShape="1">
+                          <a:blip r:embed="rId5" cstate="print">
+                            <a:extLst>
+                              <a:ext uri="{28A0092B-C50C-407E-A947-70E740481C1C}">
+                                <a14:useLocalDpi xmlns:a14="http://schemas.microsoft.com/office/drawing/2010/main" val="0"/>
+                              </a:ext>
+                            </a:extLst>
+                          </a:blip>
+                          <a:srcRect t="27008" b="16358"/>
+                          <a:stretch>
+                            <a:fillRect/>
+                          </a:stretch>
+                        </pic:blipFill>
+                        <pic:spPr bwMode="auto">
+                          <a:xfrm>
+                            <a:off x="0" y="0"/>
+                            <a:ext cx="2738120" cy="2067489"/>
+                          </a:xfrm>
+                          <a:prstGeom prst="rect">
+                            <a:avLst/>
+                          </a:prstGeom>
+                          <a:ln>
+                            <a:noFill/>
+                          </a:ln>
+                          <a:extLst>
+                            <a:ext uri="{53640926-AAD7-44D8-BBD7-CCE9431645EC}">
+                              <a14:shadowObscured xmlns:a14="http://schemas.microsoft.com/office/drawing/2010/main"/>
+                            </a:ext>
+                          </a:extLst>
+                        </pic:spPr>
+                      </pic:pic>
+                    </a:graphicData>
+                  </a:graphic>
+                </wp:inline>
+              </w:drawing>
             </w:r>
           </w:p>
         </w:tc>
@@ -5010,21 +5651,18 @@
           <w:p>
             <w:pPr>
               <w:pStyle w:val="TableParagraph"/>
+              <w:numPr>
+                <w:ilvl w:val="0"/>
+                <w:numId w:val="2"/>
+              </w:numPr>
               <w:spacing w:before="15"/>
-              <w:ind w:left="335" w:right="359" w:hanging="221"/>
-            </w:pPr>
-            <w:r>
-              <w:t>e.</w:t>
-            </w:r>
-            <w:r>
-              <w:rPr>
-                <w:spacing w:val="8"/>
-              </w:rPr>
-              <w:t xml:space="preserve"> </w:t>
-            </w:r>
+              <w:ind w:right="359"/>
+            </w:pPr>
+            <w:proofErr w:type="spellStart"/>
             <w:r>
               <w:t>Referensi</w:t>
             </w:r>
+            <w:proofErr w:type="spellEnd"/>
             <w:r>
               <w:rPr>
                 <w:spacing w:val="-6"/>
@@ -5040,18 +5678,22 @@
               </w:rPr>
               <w:t xml:space="preserve"> </w:t>
             </w:r>
+            <w:proofErr w:type="spellStart"/>
             <w:r>
               <w:t>literatur</w:t>
             </w:r>
+            <w:proofErr w:type="spellEnd"/>
             <w:r>
               <w:rPr>
                 <w:spacing w:val="10"/>
               </w:rPr>
               <w:t xml:space="preserve"> </w:t>
             </w:r>
+            <w:proofErr w:type="spellStart"/>
             <w:r>
               <w:t>peraturan</w:t>
             </w:r>
+            <w:proofErr w:type="spellEnd"/>
             <w:r>
               <w:rPr>
                 <w:spacing w:val="1"/>
@@ -5100,12 +5742,14 @@
               </w:rPr>
               <w:t xml:space="preserve"> </w:t>
             </w:r>
+            <w:proofErr w:type="spellStart"/>
             <w:r>
               <w:rPr>
                 <w:spacing w:val="-1"/>
               </w:rPr>
               <w:t>berupa</w:t>
             </w:r>
+            <w:proofErr w:type="spellEnd"/>
             <w:r>
               <w:rPr>
                 <w:spacing w:val="4"/>
@@ -5121,9 +5765,11 @@
               </w:rPr>
               <w:t xml:space="preserve"> </w:t>
             </w:r>
+            <w:proofErr w:type="spellStart"/>
             <w:r>
               <w:t>maupun</w:t>
             </w:r>
+            <w:proofErr w:type="spellEnd"/>
             <w:r>
               <w:rPr>
                 <w:spacing w:val="-5"/>
@@ -5132,6 +5778,59 @@
             </w:r>
             <w:r>
               <w:t>softcopy</w:t>
+            </w:r>
+          </w:p>
+          <w:p>
+            <w:pPr>
+              <w:pStyle w:val="TableParagraph"/>
+              <w:spacing w:before="15"/>
+              <w:ind w:left="474" w:right="359"/>
+            </w:pPr>
+            <w:r>
+              <w:rPr>
+                <w:noProof/>
+              </w:rPr>
+              <w:drawing>
+                <wp:inline distT="0" distB="0" distL="0" distR="0" wp14:anchorId="0D905936" wp14:editId="021CD18B">
+                  <wp:extent cx="2417374" cy="3212327"/>
+                  <wp:effectExtent l="0" t="0" r="2540" b="7620"/>
+                  <wp:docPr id="207523917" name="Gambar 10" descr="Sebuah gambar berisi teks, buku, Tidak bisa, surat&#10;&#10;Konten yang dihasilkan AI mungkin salah."/>
+                  <wp:cNvGraphicFramePr>
+                    <a:graphicFrameLocks xmlns:a="http://schemas.openxmlformats.org/drawingml/2006/main" noChangeAspect="1"/>
+                  </wp:cNvGraphicFramePr>
+                  <a:graphic xmlns:a="http://schemas.openxmlformats.org/drawingml/2006/main">
+                    <a:graphicData uri="http://schemas.openxmlformats.org/drawingml/2006/picture">
+                      <pic:pic xmlns:pic="http://schemas.openxmlformats.org/drawingml/2006/picture">
+                        <pic:nvPicPr>
+                          <pic:cNvPr id="207523917" name="Gambar 10" descr="Sebuah gambar berisi teks, buku, Tidak bisa, surat&#10;&#10;Konten yang dihasilkan AI mungkin salah."/>
+                          <pic:cNvPicPr/>
+                        </pic:nvPicPr>
+                        <pic:blipFill>
+                          <a:blip r:embed="rId18" cstate="print">
+                            <a:extLst>
+                              <a:ext uri="{28A0092B-C50C-407E-A947-70E740481C1C}">
+                                <a14:useLocalDpi xmlns:a14="http://schemas.microsoft.com/office/drawing/2010/main" val="0"/>
+                              </a:ext>
+                            </a:extLst>
+                          </a:blip>
+                          <a:stretch>
+                            <a:fillRect/>
+                          </a:stretch>
+                        </pic:blipFill>
+                        <pic:spPr>
+                          <a:xfrm>
+                            <a:off x="0" y="0"/>
+                            <a:ext cx="2423911" cy="3221013"/>
+                          </a:xfrm>
+                          <a:prstGeom prst="rect">
+                            <a:avLst/>
+                          </a:prstGeom>
+                        </pic:spPr>
+                      </pic:pic>
+                    </a:graphicData>
+                  </a:graphic>
+                </wp:inline>
+              </w:drawing>
             </w:r>
           </w:p>
         </w:tc>
@@ -5227,32 +5926,81 @@
           <w:p>
             <w:pPr>
               <w:pStyle w:val="TableParagraph"/>
+              <w:numPr>
+                <w:ilvl w:val="0"/>
+                <w:numId w:val="2"/>
+              </w:numPr>
               <w:spacing w:before="15"/>
-              <w:ind w:left="114"/>
-            </w:pPr>
-            <w:r>
-              <w:rPr>
-                <w:spacing w:val="-1"/>
-              </w:rPr>
-              <w:t>e.</w:t>
-            </w:r>
-            <w:r>
-              <w:rPr>
-                <w:spacing w:val="1"/>
-              </w:rPr>
-              <w:t xml:space="preserve"> </w:t>
-            </w:r>
+            </w:pPr>
+            <w:proofErr w:type="spellStart"/>
             <w:r>
               <w:t>Peralatan</w:t>
             </w:r>
+            <w:proofErr w:type="spellEnd"/>
             <w:r>
               <w:rPr>
                 <w:spacing w:val="-14"/>
               </w:rPr>
               <w:t xml:space="preserve"> </w:t>
             </w:r>
+            <w:proofErr w:type="spellStart"/>
             <w:r>
               <w:t>peracikan</w:t>
+            </w:r>
+            <w:proofErr w:type="spellEnd"/>
+          </w:p>
+          <w:p>
+            <w:pPr>
+              <w:pStyle w:val="TableParagraph"/>
+              <w:spacing w:before="15"/>
+              <w:ind w:left="474"/>
+            </w:pPr>
+            <w:r>
+              <w:rPr>
+                <w:noProof/>
+              </w:rPr>
+              <w:lastRenderedPageBreak/>
+              <w:drawing>
+                <wp:inline distT="0" distB="0" distL="0" distR="0" wp14:anchorId="27902008" wp14:editId="0C3C5886">
+                  <wp:extent cx="2738120" cy="3650615"/>
+                  <wp:effectExtent l="0" t="0" r="5080" b="6985"/>
+                  <wp:docPr id="1945607512" name="Gambar 11" descr="Sebuah gambar berisi perlengkapan meja, meja, baki, dalam ruangan&#10;&#10;Konten yang dihasilkan AI mungkin salah."/>
+                  <wp:cNvGraphicFramePr>
+                    <a:graphicFrameLocks xmlns:a="http://schemas.openxmlformats.org/drawingml/2006/main" noChangeAspect="1"/>
+                  </wp:cNvGraphicFramePr>
+                  <a:graphic xmlns:a="http://schemas.openxmlformats.org/drawingml/2006/main">
+                    <a:graphicData uri="http://schemas.openxmlformats.org/drawingml/2006/picture">
+                      <pic:pic xmlns:pic="http://schemas.openxmlformats.org/drawingml/2006/picture">
+                        <pic:nvPicPr>
+                          <pic:cNvPr id="1945607512" name="Gambar 11" descr="Sebuah gambar berisi perlengkapan meja, meja, baki, dalam ruangan&#10;&#10;Konten yang dihasilkan AI mungkin salah."/>
+                          <pic:cNvPicPr/>
+                        </pic:nvPicPr>
+                        <pic:blipFill>
+                          <a:blip r:embed="rId19" cstate="print">
+                            <a:extLst>
+                              <a:ext uri="{28A0092B-C50C-407E-A947-70E740481C1C}">
+                                <a14:useLocalDpi xmlns:a14="http://schemas.microsoft.com/office/drawing/2010/main" val="0"/>
+                              </a:ext>
+                            </a:extLst>
+                          </a:blip>
+                          <a:stretch>
+                            <a:fillRect/>
+                          </a:stretch>
+                        </pic:blipFill>
+                        <pic:spPr>
+                          <a:xfrm>
+                            <a:off x="0" y="0"/>
+                            <a:ext cx="2738120" cy="3650615"/>
+                          </a:xfrm>
+                          <a:prstGeom prst="rect">
+                            <a:avLst/>
+                          </a:prstGeom>
+                        </pic:spPr>
+                      </pic:pic>
+                    </a:graphicData>
+                  </a:graphic>
+                </wp:inline>
+              </w:drawing>
             </w:r>
           </w:p>
         </w:tc>
@@ -5267,6 +6015,7 @@
               <w:ind w:left="118"/>
             </w:pPr>
             <w:r>
+              <w:lastRenderedPageBreak/>
               <w:t>Ada</w:t>
             </w:r>
             <w:r>
@@ -5335,18 +6084,16 @@
           <w:p>
             <w:pPr>
               <w:pStyle w:val="TableParagraph"/>
+              <w:numPr>
+                <w:ilvl w:val="0"/>
+                <w:numId w:val="2"/>
+              </w:numPr>
               <w:spacing w:before="17" w:line="237" w:lineRule="auto"/>
-              <w:ind w:left="335" w:right="1844" w:hanging="221"/>
-            </w:pPr>
-            <w:r>
-              <w:t>f.</w:t>
-            </w:r>
-            <w:r>
-              <w:rPr>
-                <w:spacing w:val="2"/>
-              </w:rPr>
-              <w:t xml:space="preserve"> </w:t>
-            </w:r>
+              <w:ind w:right="1844"/>
+              <w:rPr>
+                <w:spacing w:val="-1"/>
+              </w:rPr>
+            </w:pPr>
             <w:r>
               <w:t>Air</w:t>
             </w:r>
@@ -5356,18 +6103,22 @@
               </w:rPr>
               <w:t xml:space="preserve"> </w:t>
             </w:r>
+            <w:proofErr w:type="spellStart"/>
             <w:r>
               <w:t>untuk</w:t>
             </w:r>
+            <w:proofErr w:type="spellEnd"/>
             <w:r>
               <w:rPr>
                 <w:spacing w:val="-9"/>
               </w:rPr>
               <w:t xml:space="preserve"> </w:t>
             </w:r>
+            <w:proofErr w:type="spellStart"/>
             <w:r>
               <w:t>pengencer</w:t>
             </w:r>
+            <w:proofErr w:type="spellEnd"/>
             <w:r>
               <w:rPr>
                 <w:spacing w:val="1"/>
@@ -5391,6 +6142,68 @@
                 <w:spacing w:val="-1"/>
               </w:rPr>
               <w:t>water/aquades)</w:t>
+            </w:r>
+          </w:p>
+          <w:p>
+            <w:pPr>
+              <w:pStyle w:val="TableParagraph"/>
+              <w:spacing w:before="17" w:line="237" w:lineRule="auto"/>
+              <w:ind w:left="474" w:right="1844"/>
+            </w:pPr>
+            <w:r>
+              <w:rPr>
+                <w:noProof/>
+              </w:rPr>
+              <w:drawing>
+                <wp:inline distT="0" distB="0" distL="0" distR="0" wp14:anchorId="2BD248F5" wp14:editId="53A0D438">
+                  <wp:extent cx="2205318" cy="4867910"/>
+                  <wp:effectExtent l="0" t="0" r="5080" b="0"/>
+                  <wp:docPr id="1553420630" name="Gambar 12" descr="Sebuah gambar berisi teks, makanan, minuman, air minum&#10;&#10;Konten yang dihasilkan AI mungkin salah."/>
+                  <wp:cNvGraphicFramePr>
+                    <a:graphicFrameLocks xmlns:a="http://schemas.openxmlformats.org/drawingml/2006/main" noChangeAspect="1"/>
+                  </wp:cNvGraphicFramePr>
+                  <a:graphic xmlns:a="http://schemas.openxmlformats.org/drawingml/2006/main">
+                    <a:graphicData uri="http://schemas.openxmlformats.org/drawingml/2006/picture">
+                      <pic:pic xmlns:pic="http://schemas.openxmlformats.org/drawingml/2006/picture">
+                        <pic:nvPicPr>
+                          <pic:cNvPr id="1553420630" name="Gambar 12" descr="Sebuah gambar berisi teks, makanan, minuman, air minum&#10;&#10;Konten yang dihasilkan AI mungkin salah."/>
+                          <pic:cNvPicPr/>
+                        </pic:nvPicPr>
+                        <pic:blipFill rotWithShape="1">
+                          <a:blip r:embed="rId20" cstate="print">
+                            <a:extLst>
+                              <a:ext uri="{28A0092B-C50C-407E-A947-70E740481C1C}">
+                                <a14:useLocalDpi xmlns:a14="http://schemas.microsoft.com/office/drawing/2010/main" val="0"/>
+                              </a:ext>
+                            </a:extLst>
+                          </a:blip>
+                          <a:srcRect r="19459"/>
+                          <a:stretch>
+                            <a:fillRect/>
+                          </a:stretch>
+                        </pic:blipFill>
+                        <pic:spPr bwMode="auto">
+                          <a:xfrm>
+                            <a:off x="0" y="0"/>
+                            <a:ext cx="2205318" cy="4867910"/>
+                          </a:xfrm>
+                          <a:prstGeom prst="rect">
+                            <a:avLst/>
+                          </a:prstGeom>
+                          <a:ln>
+                            <a:noFill/>
+                          </a:ln>
+                          <a:extLst>
+                            <a:ext uri="{53640926-AAD7-44D8-BBD7-CCE9431645EC}">
+                              <a14:shadowObscured xmlns:a14="http://schemas.microsoft.com/office/drawing/2010/main"/>
+                            </a:ext>
+                          </a:extLst>
+                        </pic:spPr>
+                      </pic:pic>
+                    </a:graphicData>
+                  </a:graphic>
+                </wp:inline>
+              </w:drawing>
             </w:r>
           </w:p>
         </w:tc>
@@ -5473,29 +6286,89 @@
           <w:p>
             <w:pPr>
               <w:pStyle w:val="TableParagraph"/>
+              <w:numPr>
+                <w:ilvl w:val="0"/>
+                <w:numId w:val="2"/>
+              </w:numPr>
               <w:spacing w:before="29"/>
-              <w:ind w:left="114"/>
-            </w:pPr>
-            <w:r>
-              <w:t>g.</w:t>
-            </w:r>
-            <w:r>
-              <w:rPr>
-                <w:spacing w:val="5"/>
-              </w:rPr>
-              <w:t xml:space="preserve"> </w:t>
-            </w:r>
+            </w:pPr>
+            <w:proofErr w:type="spellStart"/>
             <w:r>
               <w:t>Sendok</w:t>
             </w:r>
+            <w:proofErr w:type="spellEnd"/>
             <w:r>
               <w:rPr>
                 <w:spacing w:val="-4"/>
               </w:rPr>
               <w:t xml:space="preserve"> </w:t>
             </w:r>
+            <w:proofErr w:type="spellStart"/>
             <w:r>
               <w:t>obat</w:t>
+            </w:r>
+            <w:proofErr w:type="spellEnd"/>
+          </w:p>
+          <w:p>
+            <w:pPr>
+              <w:pStyle w:val="TableParagraph"/>
+              <w:spacing w:before="29"/>
+              <w:ind w:left="31"/>
+            </w:pPr>
+            <w:r>
+              <w:rPr>
+                <w:noProof/>
+              </w:rPr>
+              <w:drawing>
+                <wp:inline distT="0" distB="0" distL="0" distR="0" wp14:anchorId="05337423" wp14:editId="7B69E7D9">
+                  <wp:extent cx="2737826" cy="2131970"/>
+                  <wp:effectExtent l="0" t="0" r="5715" b="1905"/>
+                  <wp:docPr id="1567207660" name="Gambar 15" descr="Sebuah gambar berisi orang, dalam ruangan, jari, dinding&#10;&#10;Konten yang dihasilkan AI mungkin salah."/>
+                  <wp:cNvGraphicFramePr>
+                    <a:graphicFrameLocks xmlns:a="http://schemas.openxmlformats.org/drawingml/2006/main" noChangeAspect="1"/>
+                  </wp:cNvGraphicFramePr>
+                  <a:graphic xmlns:a="http://schemas.openxmlformats.org/drawingml/2006/main">
+                    <a:graphicData uri="http://schemas.openxmlformats.org/drawingml/2006/picture">
+                      <pic:pic xmlns:pic="http://schemas.openxmlformats.org/drawingml/2006/picture">
+                        <pic:nvPicPr>
+                          <pic:cNvPr id="1567207660" name="Gambar 15" descr="Sebuah gambar berisi orang, dalam ruangan, jari, dinding&#10;&#10;Konten yang dihasilkan AI mungkin salah."/>
+                          <pic:cNvPicPr/>
+                        </pic:nvPicPr>
+                        <pic:blipFill rotWithShape="1">
+                          <a:blip r:embed="rId21" cstate="print">
+                            <a:extLst>
+                              <a:ext uri="{28A0092B-C50C-407E-A947-70E740481C1C}">
+                                <a14:useLocalDpi xmlns:a14="http://schemas.microsoft.com/office/drawing/2010/main" val="0"/>
+                              </a:ext>
+                            </a:extLst>
+                          </a:blip>
+                          <a:srcRect t="42089" b="14110"/>
+                          <a:stretch>
+                            <a:fillRect/>
+                          </a:stretch>
+                        </pic:blipFill>
+                        <pic:spPr bwMode="auto">
+                          <a:xfrm>
+                            <a:off x="0" y="0"/>
+                            <a:ext cx="2738120" cy="2132199"/>
+                          </a:xfrm>
+                          <a:prstGeom prst="rect">
+                            <a:avLst/>
+                          </a:prstGeom>
+                          <a:ln>
+                            <a:noFill/>
+                          </a:ln>
+                          <a:extLst>
+                            <a:ext uri="{53640926-AAD7-44D8-BBD7-CCE9431645EC}">
+                              <a14:shadowObscured xmlns:a14="http://schemas.microsoft.com/office/drawing/2010/main"/>
+                            </a:ext>
+                          </a:extLst>
+                        </pic:spPr>
+                      </pic:pic>
+                    </a:graphicData>
+                  </a:graphic>
+                </wp:inline>
+              </w:drawing>
             </w:r>
           </w:p>
         </w:tc>
@@ -5578,11 +6451,14 @@
           <w:p>
             <w:pPr>
               <w:pStyle w:val="TableParagraph"/>
+              <w:numPr>
+                <w:ilvl w:val="0"/>
+                <w:numId w:val="2"/>
+              </w:numPr>
               <w:spacing w:before="24"/>
-              <w:ind w:left="114"/>
-            </w:pPr>
-            <w:r>
-              <w:t>h. Bahan</w:t>
+            </w:pPr>
+            <w:r>
+              <w:t>Bahan</w:t>
             </w:r>
             <w:r>
               <w:rPr>
@@ -5590,9 +6466,11 @@
               </w:rPr>
               <w:t xml:space="preserve"> </w:t>
             </w:r>
+            <w:proofErr w:type="spellStart"/>
             <w:r>
               <w:t>pengemas</w:t>
             </w:r>
+            <w:proofErr w:type="spellEnd"/>
             <w:r>
               <w:rPr>
                 <w:spacing w:val="-1"/>
@@ -5608,17 +6486,75 @@
               </w:rPr>
               <w:t xml:space="preserve"> </w:t>
             </w:r>
+            <w:proofErr w:type="spellStart"/>
             <w:r>
               <w:t>pembungkus</w:t>
             </w:r>
+            <w:proofErr w:type="spellEnd"/>
             <w:r>
               <w:rPr>
                 <w:spacing w:val="4"/>
               </w:rPr>
               <w:t xml:space="preserve"> </w:t>
             </w:r>
+            <w:proofErr w:type="spellStart"/>
             <w:r>
               <w:t>obat</w:t>
+            </w:r>
+            <w:proofErr w:type="spellEnd"/>
+          </w:p>
+          <w:p>
+            <w:pPr>
+              <w:pStyle w:val="TableParagraph"/>
+              <w:spacing w:before="24"/>
+              <w:ind w:left="31"/>
+            </w:pPr>
+            <w:r>
+              <w:rPr>
+                <w:noProof/>
+              </w:rPr>
+              <w:lastRenderedPageBreak/>
+              <w:drawing>
+                <wp:inline distT="0" distB="0" distL="0" distR="0" wp14:anchorId="73C5BC61" wp14:editId="13172EC5">
+                  <wp:extent cx="2738120" cy="2060575"/>
+                  <wp:effectExtent l="0" t="0" r="5080" b="0"/>
+                  <wp:docPr id="180055274" name="Gambar 14" descr="Sebuah gambar berisi teks, Pasokan umum, kotak, Produk kertas&#10;&#10;Konten yang dihasilkan AI mungkin salah."/>
+                  <wp:cNvGraphicFramePr>
+                    <a:graphicFrameLocks xmlns:a="http://schemas.openxmlformats.org/drawingml/2006/main" noChangeAspect="1"/>
+                  </wp:cNvGraphicFramePr>
+                  <a:graphic xmlns:a="http://schemas.openxmlformats.org/drawingml/2006/main">
+                    <a:graphicData uri="http://schemas.openxmlformats.org/drawingml/2006/picture">
+                      <pic:pic xmlns:pic="http://schemas.openxmlformats.org/drawingml/2006/picture">
+                        <pic:nvPicPr>
+                          <pic:cNvPr id="180055274" name="Gambar 14" descr="Sebuah gambar berisi teks, Pasokan umum, kotak, Produk kertas&#10;&#10;Konten yang dihasilkan AI mungkin salah."/>
+                          <pic:cNvPicPr/>
+                        </pic:nvPicPr>
+                        <pic:blipFill>
+                          <a:blip r:embed="rId22" cstate="print">
+                            <a:extLst>
+                              <a:ext uri="{28A0092B-C50C-407E-A947-70E740481C1C}">
+                                <a14:useLocalDpi xmlns:a14="http://schemas.microsoft.com/office/drawing/2010/main" val="0"/>
+                              </a:ext>
+                            </a:extLst>
+                          </a:blip>
+                          <a:stretch>
+                            <a:fillRect/>
+                          </a:stretch>
+                        </pic:blipFill>
+                        <pic:spPr>
+                          <a:xfrm>
+                            <a:off x="0" y="0"/>
+                            <a:ext cx="2738120" cy="2060575"/>
+                          </a:xfrm>
+                          <a:prstGeom prst="rect">
+                            <a:avLst/>
+                          </a:prstGeom>
+                        </pic:spPr>
+                      </pic:pic>
+                    </a:graphicData>
+                  </a:graphic>
+                </wp:inline>
+              </w:drawing>
             </w:r>
           </w:p>
         </w:tc>
@@ -5633,6 +6569,7 @@
               <w:ind w:left="118"/>
             </w:pPr>
             <w:r>
+              <w:lastRenderedPageBreak/>
               <w:t>Ada</w:t>
             </w:r>
             <w:r>
@@ -5719,29 +6656,90 @@
           <w:p>
             <w:pPr>
               <w:pStyle w:val="TableParagraph"/>
+              <w:numPr>
+                <w:ilvl w:val="0"/>
+                <w:numId w:val="3"/>
+              </w:numPr>
               <w:spacing w:before="24"/>
-              <w:ind w:left="114"/>
-            </w:pPr>
-            <w:r>
-              <w:t>i.</w:t>
-            </w:r>
-            <w:r>
-              <w:rPr>
-                <w:spacing w:val="-4"/>
-              </w:rPr>
-              <w:t xml:space="preserve"> </w:t>
-            </w:r>
+              <w:ind w:left="315" w:hanging="201"/>
+            </w:pPr>
+            <w:proofErr w:type="spellStart"/>
             <w:r>
               <w:t>Termometer</w:t>
             </w:r>
+            <w:proofErr w:type="spellEnd"/>
             <w:r>
               <w:rPr>
                 <w:spacing w:val="3"/>
               </w:rPr>
               <w:t xml:space="preserve"> </w:t>
             </w:r>
+            <w:proofErr w:type="spellStart"/>
             <w:r>
               <w:t>ruangan</w:t>
+            </w:r>
+            <w:proofErr w:type="spellEnd"/>
+          </w:p>
+          <w:p>
+            <w:pPr>
+              <w:pStyle w:val="TableParagraph"/>
+              <w:spacing w:before="24"/>
+              <w:ind w:left="31"/>
+            </w:pPr>
+            <w:r>
+              <w:rPr>
+                <w:noProof/>
+              </w:rPr>
+              <w:drawing>
+                <wp:inline distT="0" distB="0" distL="0" distR="0" wp14:anchorId="141B596E" wp14:editId="291988C6">
+                  <wp:extent cx="2068565" cy="2767201"/>
+                  <wp:effectExtent l="0" t="0" r="8255" b="0"/>
+                  <wp:docPr id="2138166994" name="Gambar 13" descr="Sebuah gambar berisi alat, teks, termometer, dalam ruangan&#10;&#10;Konten yang dihasilkan AI mungkin salah."/>
+                  <wp:cNvGraphicFramePr>
+                    <a:graphicFrameLocks xmlns:a="http://schemas.openxmlformats.org/drawingml/2006/main" noChangeAspect="1"/>
+                  </wp:cNvGraphicFramePr>
+                  <a:graphic xmlns:a="http://schemas.openxmlformats.org/drawingml/2006/main">
+                    <a:graphicData uri="http://schemas.openxmlformats.org/drawingml/2006/picture">
+                      <pic:pic xmlns:pic="http://schemas.openxmlformats.org/drawingml/2006/picture">
+                        <pic:nvPicPr>
+                          <pic:cNvPr id="2138166994" name="Gambar 13" descr="Sebuah gambar berisi alat, teks, termometer, dalam ruangan&#10;&#10;Konten yang dihasilkan AI mungkin salah."/>
+                          <pic:cNvPicPr/>
+                        </pic:nvPicPr>
+                        <pic:blipFill rotWithShape="1">
+                          <a:blip r:embed="rId23" cstate="print">
+                            <a:extLst>
+                              <a:ext uri="{28A0092B-C50C-407E-A947-70E740481C1C}">
+                                <a14:useLocalDpi xmlns:a14="http://schemas.microsoft.com/office/drawing/2010/main" val="0"/>
+                              </a:ext>
+                            </a:extLst>
+                          </a:blip>
+                          <a:srcRect t="12656" b="12098"/>
+                          <a:stretch>
+                            <a:fillRect/>
+                          </a:stretch>
+                        </pic:blipFill>
+                        <pic:spPr bwMode="auto">
+                          <a:xfrm>
+                            <a:off x="0" y="0"/>
+                            <a:ext cx="2071733" cy="2771439"/>
+                          </a:xfrm>
+                          <a:prstGeom prst="rect">
+                            <a:avLst/>
+                          </a:prstGeom>
+                          <a:ln>
+                            <a:noFill/>
+                          </a:ln>
+                          <a:extLst>
+                            <a:ext uri="{53640926-AAD7-44D8-BBD7-CCE9431645EC}">
+                              <a14:shadowObscured xmlns:a14="http://schemas.microsoft.com/office/drawing/2010/main"/>
+                            </a:ext>
+                          </a:extLst>
+                        </pic:spPr>
+                      </pic:pic>
+                    </a:graphicData>
+                  </a:graphic>
+                </wp:inline>
+              </w:drawing>
             </w:r>
           </w:p>
         </w:tc>
@@ -5881,8 +6879,62 @@
               </w:rPr>
               <w:t xml:space="preserve"> </w:t>
             </w:r>
+            <w:proofErr w:type="spellStart"/>
             <w:r>
               <w:t>resep</w:t>
+            </w:r>
+            <w:proofErr w:type="spellEnd"/>
+            <w:r>
+              <w:rPr>
+                <w:noProof/>
+              </w:rPr>
+              <w:t xml:space="preserve"> </w:t>
+            </w:r>
+            <w:r>
+              <w:drawing>
+                <wp:inline distT="0" distB="0" distL="0" distR="0" wp14:anchorId="450E5D5F" wp14:editId="2EB8B97E">
+                  <wp:extent cx="2630141" cy="3515794"/>
+                  <wp:effectExtent l="0" t="0" r="0" b="8890"/>
+                  <wp:docPr id="2133946388" name="Gambar 1"/>
+                  <wp:cNvGraphicFramePr>
+                    <a:graphicFrameLocks xmlns:a="http://schemas.openxmlformats.org/drawingml/2006/main" noChangeAspect="1"/>
+                  </wp:cNvGraphicFramePr>
+                  <a:graphic xmlns:a="http://schemas.openxmlformats.org/drawingml/2006/main">
+                    <a:graphicData uri="http://schemas.openxmlformats.org/drawingml/2006/picture">
+                      <pic:pic xmlns:pic="http://schemas.openxmlformats.org/drawingml/2006/picture">
+                        <pic:nvPicPr>
+                          <pic:cNvPr id="2133946388" name=""/>
+                          <pic:cNvPicPr/>
+                        </pic:nvPicPr>
+                        <pic:blipFill rotWithShape="1">
+                          <a:blip r:embed="rId24"/>
+                          <a:srcRect t="768" r="3915" b="37899"/>
+                          <a:stretch>
+                            <a:fillRect/>
+                          </a:stretch>
+                        </pic:blipFill>
+                        <pic:spPr bwMode="auto">
+                          <a:xfrm>
+                            <a:off x="0" y="0"/>
+                            <a:ext cx="2630938" cy="3516859"/>
+                          </a:xfrm>
+                          <a:prstGeom prst="rect">
+                            <a:avLst/>
+                          </a:prstGeom>
+                          <a:ln>
+                            <a:noFill/>
+                          </a:ln>
+                          <a:extLst>
+                            <a:ext uri="{53640926-AAD7-44D8-BBD7-CCE9431645EC}">
+                              <a14:shadowObscured xmlns:a14="http://schemas.microsoft.com/office/drawing/2010/main"/>
+                            </a:ext>
+                          </a:extLst>
+                        </pic:spPr>
+                      </pic:pic>
+                    </a:graphicData>
+                  </a:graphic>
+                </wp:inline>
+              </w:drawing>
             </w:r>
           </w:p>
         </w:tc>
@@ -5998,12 +7050,14 @@
               </w:rPr>
               <w:t xml:space="preserve"> </w:t>
             </w:r>
+            <w:proofErr w:type="spellStart"/>
             <w:r>
               <w:rPr>
                 <w:spacing w:val="-1"/>
               </w:rPr>
               <w:t>Etiket</w:t>
             </w:r>
+            <w:proofErr w:type="spellEnd"/>
             <w:r>
               <w:rPr>
                 <w:spacing w:val="11"/>
@@ -6028,8 +7082,119 @@
               </w:rPr>
               <w:t xml:space="preserve"> </w:t>
             </w:r>
+            <w:proofErr w:type="spellStart"/>
             <w:r>
               <w:t>obat</w:t>
+            </w:r>
+            <w:proofErr w:type="spellEnd"/>
+          </w:p>
+          <w:p>
+            <w:pPr>
+              <w:pStyle w:val="TableParagraph"/>
+              <w:spacing w:before="29"/>
+              <w:ind w:left="114"/>
+            </w:pPr>
+            <w:r>
+              <w:object w:dxaOrig="3918" w:dyaOrig="2647" w14:anchorId="3C8A8AA5">
+                <v:shapetype id="_x0000_t75" coordsize="21600,21600" o:spt="75" o:preferrelative="t" path="m@4@5l@4@11@9@11@9@5xe" filled="f" stroked="f">
+                  <v:stroke joinstyle="miter"/>
+                  <v:formulas>
+                    <v:f eqn="if lineDrawn pixelLineWidth 0"/>
+                    <v:f eqn="sum @0 1 0"/>
+                    <v:f eqn="sum 0 0 @1"/>
+                    <v:f eqn="prod @2 1 2"/>
+                    <v:f eqn="prod @3 21600 pixelWidth"/>
+                    <v:f eqn="prod @3 21600 pixelHeight"/>
+                    <v:f eqn="sum @0 0 1"/>
+                    <v:f eqn="prod @6 1 2"/>
+                    <v:f eqn="prod @7 21600 pixelWidth"/>
+                    <v:f eqn="sum @8 21600 0"/>
+                    <v:f eqn="prod @7 21600 pixelHeight"/>
+                    <v:f eqn="sum @10 21600 0"/>
+                  </v:formulas>
+                  <v:path o:extrusionok="f" gradientshapeok="t" o:connecttype="rect"/>
+                  <o:lock v:ext="edit" aspectratio="t"/>
+                </v:shapetype>
+                <v:shape id="_x0000_i1025" type="#_x0000_t75" style="width:196pt;height:132.5pt" o:ole="">
+                  <v:imagedata r:id="rId25" o:title=""/>
+                </v:shape>
+                <o:OLEObject Type="Embed" ProgID="CorelDraw.Graphic.22" ShapeID="_x0000_i1025" DrawAspect="Content" ObjectID="_1831763115" r:id="rId26"/>
+              </w:object>
+            </w:r>
+          </w:p>
+          <w:p>
+            <w:pPr>
+              <w:pStyle w:val="TableParagraph"/>
+              <w:spacing w:before="29"/>
+              <w:ind w:left="114"/>
+            </w:pPr>
+            <w:r>
+              <w:object w:dxaOrig="3918" w:dyaOrig="3145" w14:anchorId="2A00DFC7">
+                <v:shape id="_x0000_i1028" type="#_x0000_t75" style="width:196pt;height:157.5pt" o:ole="">
+                  <v:imagedata r:id="rId27" o:title=""/>
+                </v:shape>
+                <o:OLEObject Type="Embed" ProgID="CorelDraw.Graphic.22" ShapeID="_x0000_i1028" DrawAspect="Content" ObjectID="_1831763116" r:id="rId28"/>
+              </w:object>
+            </w:r>
+          </w:p>
+          <w:p>
+            <w:pPr>
+              <w:pStyle w:val="TableParagraph"/>
+              <w:spacing w:before="29"/>
+              <w:ind w:left="114"/>
+            </w:pPr>
+            <w:r>
+              <w:rPr>
+                <w:noProof/>
+              </w:rPr>
+              <w:drawing>
+                <wp:inline distT="0" distB="0" distL="0" distR="0" wp14:anchorId="406A367B" wp14:editId="76E2A86C">
+                  <wp:extent cx="2479040" cy="1682115"/>
+                  <wp:effectExtent l="0" t="0" r="0" b="0"/>
+                  <wp:docPr id="1326126493" name="Gambar 17"/>
+                  <wp:cNvGraphicFramePr>
+                    <a:graphicFrameLocks xmlns:a="http://schemas.openxmlformats.org/drawingml/2006/main" noChangeAspect="1"/>
+                  </wp:cNvGraphicFramePr>
+                  <a:graphic xmlns:a="http://schemas.openxmlformats.org/drawingml/2006/main">
+                    <a:graphicData uri="http://schemas.openxmlformats.org/drawingml/2006/picture">
+                      <pic:pic xmlns:pic="http://schemas.openxmlformats.org/drawingml/2006/picture">
+                        <pic:nvPicPr>
+                          <pic:cNvPr id="0" name="Picture 6"/>
+                          <pic:cNvPicPr>
+                            <a:picLocks noChangeAspect="1" noChangeArrowheads="1"/>
+                          </pic:cNvPicPr>
+                        </pic:nvPicPr>
+                        <pic:blipFill>
+                          <a:blip r:embed="rId29">
+                            <a:extLst>
+                              <a:ext uri="{28A0092B-C50C-407E-A947-70E740481C1C}">
+                                <a14:useLocalDpi xmlns:a14="http://schemas.microsoft.com/office/drawing/2010/main" val="0"/>
+                              </a:ext>
+                            </a:extLst>
+                          </a:blip>
+                          <a:srcRect/>
+                          <a:stretch>
+                            <a:fillRect/>
+                          </a:stretch>
+                        </pic:blipFill>
+                        <pic:spPr bwMode="auto">
+                          <a:xfrm>
+                            <a:off x="0" y="0"/>
+                            <a:ext cx="2479040" cy="1682115"/>
+                          </a:xfrm>
+                          <a:prstGeom prst="rect">
+                            <a:avLst/>
+                          </a:prstGeom>
+                          <a:noFill/>
+                          <a:ln>
+                            <a:noFill/>
+                          </a:ln>
+                        </pic:spPr>
+                      </pic:pic>
+                    </a:graphicData>
+                  </a:graphic>
+                </wp:inline>
+              </w:drawing>
             </w:r>
           </w:p>
         </w:tc>
@@ -6044,6 +7209,7 @@
               <w:ind w:left="118"/>
             </w:pPr>
             <w:r>
+              <w:lastRenderedPageBreak/>
               <w:t>Ada</w:t>
             </w:r>
             <w:r>
@@ -6178,6 +7344,13 @@
             <w:r>
               <w:t>conditioner)</w:t>
             </w:r>
+          </w:p>
+          <w:p>
+            <w:pPr>
+              <w:pStyle w:val="TableParagraph"/>
+              <w:spacing w:before="24"/>
+              <w:ind w:left="114"/>
+            </w:pPr>
           </w:p>
         </w:tc>
         <w:tc>
@@ -11191,8 +12364,192 @@
       </w:rPr>
     </w:lvl>
   </w:abstractNum>
+  <w:abstractNum w:abstractNumId="1" w15:restartNumberingAfterBreak="0">
+    <w:nsid w:val="1E7946E1"/>
+    <w:multiLevelType w:val="hybridMultilevel"/>
+    <w:tmpl w:val="1B4A4162"/>
+    <w:lvl w:ilvl="0" w:tplc="2A8823B4">
+      <w:start w:val="1"/>
+      <w:numFmt w:val="lowerLetter"/>
+      <w:lvlText w:val="%1."/>
+      <w:lvlJc w:val="left"/>
+      <w:pPr>
+        <w:ind w:left="474" w:hanging="360"/>
+      </w:pPr>
+      <w:rPr>
+        <w:rFonts w:hint="default"/>
+      </w:rPr>
+    </w:lvl>
+    <w:lvl w:ilvl="1" w:tplc="38090019" w:tentative="1">
+      <w:start w:val="1"/>
+      <w:numFmt w:val="lowerLetter"/>
+      <w:lvlText w:val="%2."/>
+      <w:lvlJc w:val="left"/>
+      <w:pPr>
+        <w:ind w:left="1194" w:hanging="360"/>
+      </w:pPr>
+    </w:lvl>
+    <w:lvl w:ilvl="2" w:tplc="3809001B" w:tentative="1">
+      <w:start w:val="1"/>
+      <w:numFmt w:val="lowerRoman"/>
+      <w:lvlText w:val="%3."/>
+      <w:lvlJc w:val="right"/>
+      <w:pPr>
+        <w:ind w:left="1914" w:hanging="180"/>
+      </w:pPr>
+    </w:lvl>
+    <w:lvl w:ilvl="3" w:tplc="3809000F" w:tentative="1">
+      <w:start w:val="1"/>
+      <w:numFmt w:val="decimal"/>
+      <w:lvlText w:val="%4."/>
+      <w:lvlJc w:val="left"/>
+      <w:pPr>
+        <w:ind w:left="2634" w:hanging="360"/>
+      </w:pPr>
+    </w:lvl>
+    <w:lvl w:ilvl="4" w:tplc="38090019" w:tentative="1">
+      <w:start w:val="1"/>
+      <w:numFmt w:val="lowerLetter"/>
+      <w:lvlText w:val="%5."/>
+      <w:lvlJc w:val="left"/>
+      <w:pPr>
+        <w:ind w:left="3354" w:hanging="360"/>
+      </w:pPr>
+    </w:lvl>
+    <w:lvl w:ilvl="5" w:tplc="3809001B" w:tentative="1">
+      <w:start w:val="1"/>
+      <w:numFmt w:val="lowerRoman"/>
+      <w:lvlText w:val="%6."/>
+      <w:lvlJc w:val="right"/>
+      <w:pPr>
+        <w:ind w:left="4074" w:hanging="180"/>
+      </w:pPr>
+    </w:lvl>
+    <w:lvl w:ilvl="6" w:tplc="3809000F" w:tentative="1">
+      <w:start w:val="1"/>
+      <w:numFmt w:val="decimal"/>
+      <w:lvlText w:val="%7."/>
+      <w:lvlJc w:val="left"/>
+      <w:pPr>
+        <w:ind w:left="4794" w:hanging="360"/>
+      </w:pPr>
+    </w:lvl>
+    <w:lvl w:ilvl="7" w:tplc="38090019" w:tentative="1">
+      <w:start w:val="1"/>
+      <w:numFmt w:val="lowerLetter"/>
+      <w:lvlText w:val="%8."/>
+      <w:lvlJc w:val="left"/>
+      <w:pPr>
+        <w:ind w:left="5514" w:hanging="360"/>
+      </w:pPr>
+    </w:lvl>
+    <w:lvl w:ilvl="8" w:tplc="3809001B" w:tentative="1">
+      <w:start w:val="1"/>
+      <w:numFmt w:val="lowerRoman"/>
+      <w:lvlText w:val="%9."/>
+      <w:lvlJc w:val="right"/>
+      <w:pPr>
+        <w:ind w:left="6234" w:hanging="180"/>
+      </w:pPr>
+    </w:lvl>
+  </w:abstractNum>
+  <w:abstractNum w:abstractNumId="2" w15:restartNumberingAfterBreak="0">
+    <w:nsid w:val="35A3748C"/>
+    <w:multiLevelType w:val="hybridMultilevel"/>
+    <w:tmpl w:val="0492BA66"/>
+    <w:lvl w:ilvl="0" w:tplc="0E9CB7DC">
+      <w:start w:val="1"/>
+      <w:numFmt w:val="lowerRoman"/>
+      <w:lvlText w:val="%1."/>
+      <w:lvlJc w:val="left"/>
+      <w:pPr>
+        <w:ind w:left="834" w:hanging="720"/>
+      </w:pPr>
+      <w:rPr>
+        <w:rFonts w:hint="default"/>
+      </w:rPr>
+    </w:lvl>
+    <w:lvl w:ilvl="1" w:tplc="38090019" w:tentative="1">
+      <w:start w:val="1"/>
+      <w:numFmt w:val="lowerLetter"/>
+      <w:lvlText w:val="%2."/>
+      <w:lvlJc w:val="left"/>
+      <w:pPr>
+        <w:ind w:left="1194" w:hanging="360"/>
+      </w:pPr>
+    </w:lvl>
+    <w:lvl w:ilvl="2" w:tplc="3809001B" w:tentative="1">
+      <w:start w:val="1"/>
+      <w:numFmt w:val="lowerRoman"/>
+      <w:lvlText w:val="%3."/>
+      <w:lvlJc w:val="right"/>
+      <w:pPr>
+        <w:ind w:left="1914" w:hanging="180"/>
+      </w:pPr>
+    </w:lvl>
+    <w:lvl w:ilvl="3" w:tplc="3809000F" w:tentative="1">
+      <w:start w:val="1"/>
+      <w:numFmt w:val="decimal"/>
+      <w:lvlText w:val="%4."/>
+      <w:lvlJc w:val="left"/>
+      <w:pPr>
+        <w:ind w:left="2634" w:hanging="360"/>
+      </w:pPr>
+    </w:lvl>
+    <w:lvl w:ilvl="4" w:tplc="38090019" w:tentative="1">
+      <w:start w:val="1"/>
+      <w:numFmt w:val="lowerLetter"/>
+      <w:lvlText w:val="%5."/>
+      <w:lvlJc w:val="left"/>
+      <w:pPr>
+        <w:ind w:left="3354" w:hanging="360"/>
+      </w:pPr>
+    </w:lvl>
+    <w:lvl w:ilvl="5" w:tplc="3809001B" w:tentative="1">
+      <w:start w:val="1"/>
+      <w:numFmt w:val="lowerRoman"/>
+      <w:lvlText w:val="%6."/>
+      <w:lvlJc w:val="right"/>
+      <w:pPr>
+        <w:ind w:left="4074" w:hanging="180"/>
+      </w:pPr>
+    </w:lvl>
+    <w:lvl w:ilvl="6" w:tplc="3809000F" w:tentative="1">
+      <w:start w:val="1"/>
+      <w:numFmt w:val="decimal"/>
+      <w:lvlText w:val="%7."/>
+      <w:lvlJc w:val="left"/>
+      <w:pPr>
+        <w:ind w:left="4794" w:hanging="360"/>
+      </w:pPr>
+    </w:lvl>
+    <w:lvl w:ilvl="7" w:tplc="38090019" w:tentative="1">
+      <w:start w:val="1"/>
+      <w:numFmt w:val="lowerLetter"/>
+      <w:lvlText w:val="%8."/>
+      <w:lvlJc w:val="left"/>
+      <w:pPr>
+        <w:ind w:left="5514" w:hanging="360"/>
+      </w:pPr>
+    </w:lvl>
+    <w:lvl w:ilvl="8" w:tplc="3809001B" w:tentative="1">
+      <w:start w:val="1"/>
+      <w:numFmt w:val="lowerRoman"/>
+      <w:lvlText w:val="%9."/>
+      <w:lvlJc w:val="right"/>
+      <w:pPr>
+        <w:ind w:left="6234" w:hanging="180"/>
+      </w:pPr>
+    </w:lvl>
+  </w:abstractNum>
   <w:num w:numId="1" w16cid:durableId="761217288">
     <w:abstractNumId w:val="0"/>
+  </w:num>
+  <w:num w:numId="2" w16cid:durableId="895746571">
+    <w:abstractNumId w:val="1"/>
+  </w:num>
+  <w:num w:numId="3" w16cid:durableId="919564895">
+    <w:abstractNumId w:val="2"/>
   </w:num>
 </w:numbering>
 </file>

</xml_diff>